<commit_message>
docs: atualiza estratégia de testes e registra defeitos corrigidos
Documentação Final versão 1.1: pirâmide com 83 testes e 99% de
cobertura, roteiro de teste de sistema no navegador (seção 6.3) e
Apêndice F com os defeitos encontrados e seus testes de regressão.

Co-Authored-By: Claude Opus 5.5 <noreply@anthropic.com>
Claude-Session: https://claude.ai/code/session_01MkVTYkAbQhM5mwtquJj4Vy
</commit_message>
<xml_diff>
--- a/docs/Documentacao_Final.docx
+++ b/docs/Documentacao_Final.docx
@@ -56,7 +56,7 @@
           <w:sz w:val="26"/>
           <w:szCs w:val="26"/>
         </w:rPr>
-        <w:t xml:space="preserve">Versão 1.0</w:t>
+        <w:t xml:space="preserve">Versão 1.1</w:t>
       </w:r>
     </w:p>
     <w:p>
@@ -639,6 +639,127 @@
           </w:p>
         </w:tc>
       </w:tr>
+      <w:tr>
+        <w:trPr>
+          <w:cantSplit/>
+        </w:trPr>
+        <w:tc>
+          <w:tcPr>
+            <w:tcW w:type="dxa" w:w="907"/>
+            <w:tcBorders>
+              <w:top w:val="single" w:color="8EA9DB" w:sz="4"/>
+              <w:left w:val="single" w:color="8EA9DB" w:sz="4"/>
+              <w:bottom w:val="single" w:color="8EA9DB" w:sz="4"/>
+              <w:right w:val="single" w:color="8EA9DB" w:sz="4"/>
+            </w:tcBorders>
+            <w:tcMar>
+              <w:top w:type="dxa" w:w="60"/>
+              <w:left w:type="dxa" w:w="100"/>
+              <w:bottom w:type="dxa" w:w="60"/>
+              <w:right w:type="dxa" w:w="100"/>
+            </w:tcMar>
+          </w:tcPr>
+          <w:p>
+            <w:pPr>
+              <w:spacing w:after="20"/>
+            </w:pPr>
+            <w:r>
+              <w:rPr>
+                <w:sz w:val="19"/>
+                <w:szCs w:val="19"/>
+              </w:rPr>
+              <w:t xml:space="preserve">1.1</w:t>
+            </w:r>
+          </w:p>
+        </w:tc>
+        <w:tc>
+          <w:tcPr>
+            <w:tcW w:type="dxa" w:w="1269"/>
+            <w:tcBorders>
+              <w:top w:val="single" w:color="8EA9DB" w:sz="4"/>
+              <w:left w:val="single" w:color="8EA9DB" w:sz="4"/>
+              <w:bottom w:val="single" w:color="8EA9DB" w:sz="4"/>
+              <w:right w:val="single" w:color="8EA9DB" w:sz="4"/>
+            </w:tcBorders>
+            <w:tcMar>
+              <w:top w:type="dxa" w:w="60"/>
+              <w:left w:type="dxa" w:w="100"/>
+              <w:bottom w:type="dxa" w:w="60"/>
+              <w:right w:type="dxa" w:w="100"/>
+            </w:tcMar>
+          </w:tcPr>
+          <w:p>
+            <w:pPr>
+              <w:spacing w:after="20"/>
+            </w:pPr>
+            <w:r>
+              <w:rPr>
+                <w:sz w:val="19"/>
+                <w:szCs w:val="19"/>
+              </w:rPr>
+              <w:t xml:space="preserve">25/10/2026</w:t>
+            </w:r>
+          </w:p>
+        </w:tc>
+        <w:tc>
+          <w:tcPr>
+            <w:tcW w:type="dxa" w:w="2358"/>
+            <w:tcBorders>
+              <w:top w:val="single" w:color="8EA9DB" w:sz="4"/>
+              <w:left w:val="single" w:color="8EA9DB" w:sz="4"/>
+              <w:bottom w:val="single" w:color="8EA9DB" w:sz="4"/>
+              <w:right w:val="single" w:color="8EA9DB" w:sz="4"/>
+            </w:tcBorders>
+            <w:tcMar>
+              <w:top w:type="dxa" w:w="60"/>
+              <w:left w:type="dxa" w:w="100"/>
+              <w:bottom w:type="dxa" w:w="60"/>
+              <w:right w:type="dxa" w:w="100"/>
+            </w:tcMar>
+          </w:tcPr>
+          <w:p>
+            <w:pPr>
+              <w:spacing w:after="20"/>
+            </w:pPr>
+            <w:r>
+              <w:rPr>
+                <w:sz w:val="19"/>
+                <w:szCs w:val="19"/>
+              </w:rPr>
+              <w:t xml:space="preserve">Bruno Pinheiro Dos Santos</w:t>
+            </w:r>
+          </w:p>
+        </w:tc>
+        <w:tc>
+          <w:tcPr>
+            <w:tcW w:type="dxa" w:w="4537"/>
+            <w:tcBorders>
+              <w:top w:val="single" w:color="8EA9DB" w:sz="4"/>
+              <w:left w:val="single" w:color="8EA9DB" w:sz="4"/>
+              <w:bottom w:val="single" w:color="8EA9DB" w:sz="4"/>
+              <w:right w:val="single" w:color="8EA9DB" w:sz="4"/>
+            </w:tcBorders>
+            <w:tcMar>
+              <w:top w:type="dxa" w:w="60"/>
+              <w:left w:type="dxa" w:w="100"/>
+              <w:bottom w:type="dxa" w:w="60"/>
+              <w:right w:type="dxa" w:w="100"/>
+            </w:tcMar>
+          </w:tcPr>
+          <w:p>
+            <w:pPr>
+              <w:spacing w:after="20"/>
+            </w:pPr>
+            <w:r>
+              <w:rPr>
+                <w:sz w:val="19"/>
+                <w:szCs w:val="19"/>
+              </w:rPr>
+              <w:t xml:space="preserve">Rodada de testes exploratórios e de sistema; 6 defeitos corrigidos; 83 testes e 99% de cobertura.</w:t>
+            </w:r>
+          </w:p>
+        </w:tc>
+      </w:tr>
     </w:tbl>
     <w:p>
       <w:pPr>
@@ -810,7 +931,7 @@
         <w:jc w:val="both"/>
       </w:pPr>
       <w:r>
-        <w:t xml:space="preserve">O sistema é operado pelos funcionários da locadora (atendentes e gerentes), que acessam com login e senha. O recorte entregue cobre cinco casos de uso completos: manter veículo (UC01), manter cliente (UC02), consultar disponibilidade e reservar (UC03), registrar retirada (UC04) e registrar devolução e apurar valores (UC05). A suíte de 64 testes automatizados comprova o comportamento, inclusive o exemplo numérico de referência do projeto (total de R$ 690,00).</w:t>
+        <w:t xml:space="preserve">O sistema é operado pelos funcionários da locadora (atendentes e gerentes), que acessam com login e senha. O recorte entregue cobre cinco casos de uso completos: manter veículo (UC01), manter cliente (UC02), consultar disponibilidade e reservar (UC03), registrar retirada (UC04) e registrar devolução e apurar valores (UC05). A suíte de 83 testes automatizados (99% de cobertura de código) e um teste de sistema no navegador comprovam o comportamento, inclusive o exemplo numérico de referência do projeto (total de R$ 690,00).</w:t>
       </w:r>
     </w:p>
     <w:p>
@@ -1350,7 +1471,7 @@
                 <w:sz w:val="19"/>
                 <w:szCs w:val="19"/>
               </w:rPr>
-              <w:t xml:space="preserve">64 testes automatizados (unidade e integração), todos passando</w:t>
+              <w:t xml:space="preserve">83 testes automatizados (unidade, integração e interface), 99% de cobertura de código, mais teste de sistema no navegador</w:t>
             </w:r>
           </w:p>
         </w:tc>
@@ -7918,7 +8039,283 @@
                 <w:sz w:val="19"/>
                 <w:szCs w:val="19"/>
               </w:rPr>
-              <w:t xml:space="preserve">64 de 64 (≈ 2,5 s)</w:t>
+              <w:t xml:space="preserve">83 de 83 (≈ 13 s), também em ordem aleatória</w:t>
+            </w:r>
+          </w:p>
+        </w:tc>
+      </w:tr>
+      <w:tr>
+        <w:trPr>
+          <w:cantSplit/>
+        </w:trPr>
+        <w:tc>
+          <w:tcPr>
+            <w:tcW w:type="dxa" w:w="3887"/>
+            <w:tcBorders>
+              <w:top w:val="single" w:color="8EA9DB" w:sz="4"/>
+              <w:left w:val="single" w:color="8EA9DB" w:sz="4"/>
+              <w:bottom w:val="single" w:color="8EA9DB" w:sz="4"/>
+              <w:right w:val="single" w:color="8EA9DB" w:sz="4"/>
+            </w:tcBorders>
+            <w:tcMar>
+              <w:top w:type="dxa" w:w="60"/>
+              <w:left w:type="dxa" w:w="100"/>
+              <w:bottom w:type="dxa" w:w="60"/>
+              <w:right w:type="dxa" w:w="100"/>
+            </w:tcMar>
+          </w:tcPr>
+          <w:p>
+            <w:pPr>
+              <w:spacing w:after="20"/>
+            </w:pPr>
+            <w:r>
+              <w:rPr>
+                <w:sz w:val="19"/>
+                <w:szCs w:val="19"/>
+              </w:rPr>
+              <w:t xml:space="preserve">Cobertura de código (coverage.py)</w:t>
+            </w:r>
+          </w:p>
+        </w:tc>
+        <w:tc>
+          <w:tcPr>
+            <w:tcW w:type="dxa" w:w="1814"/>
+            <w:tcBorders>
+              <w:top w:val="single" w:color="8EA9DB" w:sz="4"/>
+              <w:left w:val="single" w:color="8EA9DB" w:sz="4"/>
+              <w:bottom w:val="single" w:color="8EA9DB" w:sz="4"/>
+              <w:right w:val="single" w:color="8EA9DB" w:sz="4"/>
+            </w:tcBorders>
+            <w:tcMar>
+              <w:top w:type="dxa" w:w="60"/>
+              <w:left w:type="dxa" w:w="100"/>
+              <w:bottom w:type="dxa" w:w="60"/>
+              <w:right w:type="dxa" w:w="100"/>
+            </w:tcMar>
+          </w:tcPr>
+          <w:p>
+            <w:pPr>
+              <w:spacing w:after="20"/>
+            </w:pPr>
+            <w:r>
+              <w:rPr>
+                <w:sz w:val="19"/>
+                <w:szCs w:val="19"/>
+              </w:rPr>
+              <w:t xml:space="preserve">≥ 90%</w:t>
+            </w:r>
+          </w:p>
+        </w:tc>
+        <w:tc>
+          <w:tcPr>
+            <w:tcW w:type="dxa" w:w="3370"/>
+            <w:tcBorders>
+              <w:top w:val="single" w:color="8EA9DB" w:sz="4"/>
+              <w:left w:val="single" w:color="8EA9DB" w:sz="4"/>
+              <w:bottom w:val="single" w:color="8EA9DB" w:sz="4"/>
+              <w:right w:val="single" w:color="8EA9DB" w:sz="4"/>
+            </w:tcBorders>
+            <w:tcMar>
+              <w:top w:type="dxa" w:w="60"/>
+              <w:left w:type="dxa" w:w="100"/>
+              <w:bottom w:type="dxa" w:w="60"/>
+              <w:right w:type="dxa" w:w="100"/>
+            </w:tcMar>
+          </w:tcPr>
+          <w:p>
+            <w:pPr>
+              <w:spacing w:after="20"/>
+            </w:pPr>
+            <w:r>
+              <w:rPr>
+                <w:sz w:val="19"/>
+                <w:szCs w:val="19"/>
+              </w:rPr>
+              <w:t xml:space="preserve">99% (views, forms, admin, regras e fórmulas)</w:t>
+            </w:r>
+          </w:p>
+        </w:tc>
+      </w:tr>
+      <w:tr>
+        <w:trPr>
+          <w:cantSplit/>
+        </w:trPr>
+        <w:tc>
+          <w:tcPr>
+            <w:tcW w:type="dxa" w:w="3887"/>
+            <w:tcBorders>
+              <w:top w:val="single" w:color="8EA9DB" w:sz="4"/>
+              <w:left w:val="single" w:color="8EA9DB" w:sz="4"/>
+              <w:bottom w:val="single" w:color="8EA9DB" w:sz="4"/>
+              <w:right w:val="single" w:color="8EA9DB" w:sz="4"/>
+            </w:tcBorders>
+            <w:tcMar>
+              <w:top w:type="dxa" w:w="60"/>
+              <w:left w:type="dxa" w:w="100"/>
+              <w:bottom w:type="dxa" w:w="60"/>
+              <w:right w:type="dxa" w:w="100"/>
+            </w:tcMar>
+          </w:tcPr>
+          <w:p>
+            <w:pPr>
+              <w:spacing w:after="20"/>
+            </w:pPr>
+            <w:r>
+              <w:rPr>
+                <w:sz w:val="19"/>
+                <w:szCs w:val="19"/>
+              </w:rPr>
+              <w:t xml:space="preserve">Teste de sistema no navegador (Chromium)</w:t>
+            </w:r>
+          </w:p>
+        </w:tc>
+        <w:tc>
+          <w:tcPr>
+            <w:tcW w:type="dxa" w:w="1814"/>
+            <w:tcBorders>
+              <w:top w:val="single" w:color="8EA9DB" w:sz="4"/>
+              <w:left w:val="single" w:color="8EA9DB" w:sz="4"/>
+              <w:bottom w:val="single" w:color="8EA9DB" w:sz="4"/>
+              <w:right w:val="single" w:color="8EA9DB" w:sz="4"/>
+            </w:tcBorders>
+            <w:tcMar>
+              <w:top w:type="dxa" w:w="60"/>
+              <w:left w:type="dxa" w:w="100"/>
+              <w:bottom w:type="dxa" w:w="60"/>
+              <w:right w:type="dxa" w:w="100"/>
+            </w:tcMar>
+          </w:tcPr>
+          <w:p>
+            <w:pPr>
+              <w:spacing w:after="20"/>
+            </w:pPr>
+            <w:r>
+              <w:rPr>
+                <w:sz w:val="19"/>
+                <w:szCs w:val="19"/>
+              </w:rPr>
+              <w:t xml:space="preserve">100% dos passos</w:t>
+            </w:r>
+          </w:p>
+        </w:tc>
+        <w:tc>
+          <w:tcPr>
+            <w:tcW w:type="dxa" w:w="3370"/>
+            <w:tcBorders>
+              <w:top w:val="single" w:color="8EA9DB" w:sz="4"/>
+              <w:left w:val="single" w:color="8EA9DB" w:sz="4"/>
+              <w:bottom w:val="single" w:color="8EA9DB" w:sz="4"/>
+              <w:right w:val="single" w:color="8EA9DB" w:sz="4"/>
+            </w:tcBorders>
+            <w:tcMar>
+              <w:top w:type="dxa" w:w="60"/>
+              <w:left w:type="dxa" w:w="100"/>
+              <w:bottom w:type="dxa" w:w="60"/>
+              <w:right w:type="dxa" w:w="100"/>
+            </w:tcMar>
+          </w:tcPr>
+          <w:p>
+            <w:pPr>
+              <w:spacing w:after="20"/>
+            </w:pPr>
+            <w:r>
+              <w:rPr>
+                <w:sz w:val="19"/>
+                <w:szCs w:val="19"/>
+              </w:rPr>
+              <w:t xml:space="preserve">25 de 25 passos, sem erro de JavaScript nem HTTP 500</w:t>
+            </w:r>
+          </w:p>
+        </w:tc>
+      </w:tr>
+      <w:tr>
+        <w:trPr>
+          <w:cantSplit/>
+        </w:trPr>
+        <w:tc>
+          <w:tcPr>
+            <w:tcW w:type="dxa" w:w="3887"/>
+            <w:tcBorders>
+              <w:top w:val="single" w:color="8EA9DB" w:sz="4"/>
+              <w:left w:val="single" w:color="8EA9DB" w:sz="4"/>
+              <w:bottom w:val="single" w:color="8EA9DB" w:sz="4"/>
+              <w:right w:val="single" w:color="8EA9DB" w:sz="4"/>
+            </w:tcBorders>
+            <w:tcMar>
+              <w:top w:type="dxa" w:w="60"/>
+              <w:left w:type="dxa" w:w="100"/>
+              <w:bottom w:type="dxa" w:w="60"/>
+              <w:right w:type="dxa" w:w="100"/>
+            </w:tcMar>
+          </w:tcPr>
+          <w:p>
+            <w:pPr>
+              <w:spacing w:after="20"/>
+            </w:pPr>
+            <w:r>
+              <w:rPr>
+                <w:sz w:val="19"/>
+                <w:szCs w:val="19"/>
+              </w:rPr>
+              <w:t xml:space="preserve">Defeitos conhecidos em aberto</w:t>
+            </w:r>
+          </w:p>
+        </w:tc>
+        <w:tc>
+          <w:tcPr>
+            <w:tcW w:type="dxa" w:w="1814"/>
+            <w:tcBorders>
+              <w:top w:val="single" w:color="8EA9DB" w:sz="4"/>
+              <w:left w:val="single" w:color="8EA9DB" w:sz="4"/>
+              <w:bottom w:val="single" w:color="8EA9DB" w:sz="4"/>
+              <w:right w:val="single" w:color="8EA9DB" w:sz="4"/>
+            </w:tcBorders>
+            <w:tcMar>
+              <w:top w:type="dxa" w:w="60"/>
+              <w:left w:type="dxa" w:w="100"/>
+              <w:bottom w:type="dxa" w:w="60"/>
+              <w:right w:type="dxa" w:w="100"/>
+            </w:tcMar>
+          </w:tcPr>
+          <w:p>
+            <w:pPr>
+              <w:spacing w:after="20"/>
+            </w:pPr>
+            <w:r>
+              <w:rPr>
+                <w:sz w:val="19"/>
+                <w:szCs w:val="19"/>
+              </w:rPr>
+              <w:t xml:space="preserve">0</w:t>
+            </w:r>
+          </w:p>
+        </w:tc>
+        <w:tc>
+          <w:tcPr>
+            <w:tcW w:type="dxa" w:w="3370"/>
+            <w:tcBorders>
+              <w:top w:val="single" w:color="8EA9DB" w:sz="4"/>
+              <w:left w:val="single" w:color="8EA9DB" w:sz="4"/>
+              <w:bottom w:val="single" w:color="8EA9DB" w:sz="4"/>
+              <w:right w:val="single" w:color="8EA9DB" w:sz="4"/>
+            </w:tcBorders>
+            <w:tcMar>
+              <w:top w:type="dxa" w:w="60"/>
+              <w:left w:type="dxa" w:w="100"/>
+              <w:bottom w:type="dxa" w:w="60"/>
+              <w:right w:type="dxa" w:w="100"/>
+            </w:tcMar>
+          </w:tcPr>
+          <w:p>
+            <w:pPr>
+              <w:spacing w:after="20"/>
+            </w:pPr>
+            <w:r>
+              <w:rPr>
+                <w:sz w:val="19"/>
+                <w:szCs w:val="19"/>
+              </w:rPr>
+              <w:t xml:space="preserve">0 — 6 defeitos encontrados nos testes foram corrigidos (Apêndice F)</w:t>
             </w:r>
           </w:p>
         </w:tc>
@@ -10332,7 +10729,7 @@
                 <w:sz w:val="19"/>
                 <w:szCs w:val="19"/>
               </w:rPr>
-              <w:t xml:space="preserve">64 testes em três níveis (fórmulas, regras e integração).</w:t>
+              <w:t xml:space="preserve">83 testes em três níveis (fórmulas, regras, integração e interface).</w:t>
             </w:r>
           </w:p>
         </w:tc>
@@ -27339,7 +27736,7 @@
                 <w:sz w:val="19"/>
                 <w:szCs w:val="19"/>
               </w:rPr>
-              <w:t xml:space="preserve">Topo — interface (ponta a ponta no servidor)</w:t>
+              <w:t xml:space="preserve">Topo — sistema (navegador real)</w:t>
             </w:r>
           </w:p>
         </w:tc>
@@ -27368,7 +27765,7 @@
                 <w:sz w:val="19"/>
                 <w:szCs w:val="19"/>
               </w:rPr>
-              <w:t xml:space="preserve">test_views.py · InterfaceTests</w:t>
+              <w:t xml:space="preserve">roteiro E2E com Playwright (Chromium)</w:t>
             </w:r>
           </w:p>
         </w:tc>
@@ -27397,7 +27794,7 @@
                 <w:sz w:val="19"/>
                 <w:szCs w:val="19"/>
               </w:rPr>
-              <w:t xml:space="preserve">4</w:t>
+              <w:t xml:space="preserve">25 passos</w:t>
             </w:r>
           </w:p>
         </w:tc>
@@ -27426,7 +27823,7 @@
                 <w:sz w:val="19"/>
                 <w:szCs w:val="19"/>
               </w:rPr>
-              <w:t xml:space="preserve">Login obrigatório, carregamento de todas as telas, validação de CPF no formulário e o ciclo completo reservar → reserva sobreposta recusada → retirar → devolver com atraso (R$ 690,00).</w:t>
+              <w:t xml:space="preserve">Login, cadastros, busca, reserva, retirada, devolução com avaria, multa de atraso, tela de celular, ausência de erros de JavaScript e HTTP 500. Ver seção 6.3.</w:t>
             </w:r>
           </w:p>
         </w:tc>
@@ -27455,7 +27852,7 @@
                 <w:sz w:val="19"/>
                 <w:szCs w:val="19"/>
               </w:rPr>
-              <w:t xml:space="preserve">django.test.TestCase + Client</w:t>
+              <w:t xml:space="preserve">Teste de sistema / aceitação</w:t>
             </w:r>
           </w:p>
         </w:tc>
@@ -27489,7 +27886,7 @@
                 <w:sz w:val="19"/>
                 <w:szCs w:val="19"/>
               </w:rPr>
-              <w:t xml:space="preserve">Meio — integração com banco</w:t>
+              <w:t xml:space="preserve">Topo — interface (servidor)</w:t>
             </w:r>
           </w:p>
         </w:tc>
@@ -27518,7 +27915,7 @@
                 <w:sz w:val="19"/>
                 <w:szCs w:val="19"/>
               </w:rPr>
-              <w:t xml:space="preserve">test_views.py · Disponibilidade, Reserva, RetiradaDevolucao</w:t>
+              <w:t xml:space="preserve">test_views.py · Interface, TelasDeOperacao, Cadastros</w:t>
             </w:r>
           </w:p>
         </w:tc>
@@ -27576,7 +27973,7 @@
                 <w:sz w:val="19"/>
                 <w:szCs w:val="19"/>
               </w:rPr>
-              <w:t xml:space="preserve">Operações reais no banco: RN01–RN06, RN08, RN11–RN19, snapshot de preço, locação de balcão, ATRASADA e EXPIRADA por tempo.</w:t>
+              <w:t xml:space="preserve">Login obrigatório em todas as rotas, todas as telas e filtros, caminhos de erro de cada formulário, admin com as mesmas validações, ciclo completo reservar → retirar → devolver com atraso (R$ 690,00) e regressões dos defeitos corrigidos.</w:t>
             </w:r>
           </w:p>
         </w:tc>
@@ -27605,7 +28002,7 @@
                 <w:sz w:val="19"/>
                 <w:szCs w:val="19"/>
               </w:rPr>
-              <w:t xml:space="preserve">django.test.TestCase</w:t>
+              <w:t xml:space="preserve">django.test.TestCase + Client</w:t>
             </w:r>
           </w:p>
         </w:tc>
@@ -27639,7 +28036,7 @@
                 <w:sz w:val="19"/>
                 <w:szCs w:val="19"/>
               </w:rPr>
-              <w:t xml:space="preserve">Base — unidade (regras)</w:t>
+              <w:t xml:space="preserve">Meio — integração com banco</w:t>
             </w:r>
           </w:p>
         </w:tc>
@@ -27668,7 +28065,7 @@
                 <w:sz w:val="19"/>
                 <w:szCs w:val="19"/>
               </w:rPr>
-              <w:t xml:space="preserve">test_rules.py</w:t>
+              <w:t xml:space="preserve">test_views.py · Disponibilidade, Reserva, RetiradaDevolucao, Seed</w:t>
             </w:r>
           </w:p>
         </w:tc>
@@ -27697,7 +28094,7 @@
                 <w:sz w:val="19"/>
                 <w:szCs w:val="19"/>
               </w:rPr>
-              <w:t xml:space="preserve">24</w:t>
+              <w:t xml:space="preserve">23</w:t>
             </w:r>
           </w:p>
         </w:tc>
@@ -27726,7 +28123,7 @@
                 <w:sz w:val="19"/>
                 <w:szCs w:val="19"/>
               </w:rPr>
-              <w:t xml:space="preserve">Sobreposição (8 cenários), idade, CNH, cliente inativo/atrasado, período, cancelamento, expiração, retirada e km.</w:t>
+              <w:t xml:space="preserve">Operações reais no banco: RN01–RN06, RN08, RN11–RN19, snapshot de preço, locação de balcão, ATRASADA e EXPIRADA por tempo e o comando seed.</w:t>
             </w:r>
           </w:p>
         </w:tc>
@@ -27755,7 +28152,7 @@
                 <w:sz w:val="19"/>
                 <w:szCs w:val="19"/>
               </w:rPr>
-              <w:t xml:space="preserve">SimpleTestCase (sem banco)</w:t>
+              <w:t xml:space="preserve">django.test.TestCase</w:t>
             </w:r>
           </w:p>
         </w:tc>
@@ -27789,6 +28186,156 @@
                 <w:sz w:val="19"/>
                 <w:szCs w:val="19"/>
               </w:rPr>
+              <w:t xml:space="preserve">Base — unidade (regras)</w:t>
+            </w:r>
+          </w:p>
+        </w:tc>
+        <w:tc>
+          <w:tcPr>
+            <w:tcW w:type="dxa" w:w="1774"/>
+            <w:tcBorders>
+              <w:top w:val="single" w:color="8EA9DB" w:sz="4"/>
+              <w:left w:val="single" w:color="8EA9DB" w:sz="4"/>
+              <w:bottom w:val="single" w:color="8EA9DB" w:sz="4"/>
+              <w:right w:val="single" w:color="8EA9DB" w:sz="4"/>
+            </w:tcBorders>
+            <w:tcMar>
+              <w:top w:type="dxa" w:w="60"/>
+              <w:left w:type="dxa" w:w="100"/>
+              <w:bottom w:type="dxa" w:w="60"/>
+              <w:right w:type="dxa" w:w="100"/>
+            </w:tcMar>
+          </w:tcPr>
+          <w:p>
+            <w:pPr>
+              <w:spacing w:after="20"/>
+            </w:pPr>
+            <w:r>
+              <w:rPr>
+                <w:sz w:val="19"/>
+                <w:szCs w:val="19"/>
+              </w:rPr>
+              <w:t xml:space="preserve">test_rules.py</w:t>
+            </w:r>
+          </w:p>
+        </w:tc>
+        <w:tc>
+          <w:tcPr>
+            <w:tcW w:type="dxa" w:w="591"/>
+            <w:tcBorders>
+              <w:top w:val="single" w:color="8EA9DB" w:sz="4"/>
+              <w:left w:val="single" w:color="8EA9DB" w:sz="4"/>
+              <w:bottom w:val="single" w:color="8EA9DB" w:sz="4"/>
+              <w:right w:val="single" w:color="8EA9DB" w:sz="4"/>
+            </w:tcBorders>
+            <w:tcMar>
+              <w:top w:type="dxa" w:w="60"/>
+              <w:left w:type="dxa" w:w="100"/>
+              <w:bottom w:type="dxa" w:w="60"/>
+              <w:right w:type="dxa" w:w="100"/>
+            </w:tcMar>
+          </w:tcPr>
+          <w:p>
+            <w:pPr>
+              <w:spacing w:after="20"/>
+            </w:pPr>
+            <w:r>
+              <w:rPr>
+                <w:sz w:val="19"/>
+                <w:szCs w:val="19"/>
+              </w:rPr>
+              <w:t xml:space="preserve">24</w:t>
+            </w:r>
+          </w:p>
+        </w:tc>
+        <w:tc>
+          <w:tcPr>
+            <w:tcW w:type="dxa" w:w="3549"/>
+            <w:tcBorders>
+              <w:top w:val="single" w:color="8EA9DB" w:sz="4"/>
+              <w:left w:val="single" w:color="8EA9DB" w:sz="4"/>
+              <w:bottom w:val="single" w:color="8EA9DB" w:sz="4"/>
+              <w:right w:val="single" w:color="8EA9DB" w:sz="4"/>
+            </w:tcBorders>
+            <w:tcMar>
+              <w:top w:type="dxa" w:w="60"/>
+              <w:left w:type="dxa" w:w="100"/>
+              <w:bottom w:type="dxa" w:w="60"/>
+              <w:right w:type="dxa" w:w="100"/>
+            </w:tcMar>
+          </w:tcPr>
+          <w:p>
+            <w:pPr>
+              <w:spacing w:after="20"/>
+            </w:pPr>
+            <w:r>
+              <w:rPr>
+                <w:sz w:val="19"/>
+                <w:szCs w:val="19"/>
+              </w:rPr>
+              <w:t xml:space="preserve">Sobreposição (8 cenários), idade, CNH, cliente inativo/atrasado, período, cancelamento, expiração, retirada e km.</w:t>
+            </w:r>
+          </w:p>
+        </w:tc>
+        <w:tc>
+          <w:tcPr>
+            <w:tcW w:type="dxa" w:w="1580"/>
+            <w:tcBorders>
+              <w:top w:val="single" w:color="8EA9DB" w:sz="4"/>
+              <w:left w:val="single" w:color="8EA9DB" w:sz="4"/>
+              <w:bottom w:val="single" w:color="8EA9DB" w:sz="4"/>
+              <w:right w:val="single" w:color="8EA9DB" w:sz="4"/>
+            </w:tcBorders>
+            <w:tcMar>
+              <w:top w:type="dxa" w:w="60"/>
+              <w:left w:type="dxa" w:w="100"/>
+              <w:bottom w:type="dxa" w:w="60"/>
+              <w:right w:type="dxa" w:w="100"/>
+            </w:tcMar>
+          </w:tcPr>
+          <w:p>
+            <w:pPr>
+              <w:spacing w:after="20"/>
+            </w:pPr>
+            <w:r>
+              <w:rPr>
+                <w:sz w:val="19"/>
+                <w:szCs w:val="19"/>
+              </w:rPr>
+              <w:t xml:space="preserve">SimpleTestCase (sem banco)</w:t>
+            </w:r>
+          </w:p>
+        </w:tc>
+      </w:tr>
+      <w:tr>
+        <w:trPr>
+          <w:cantSplit/>
+        </w:trPr>
+        <w:tc>
+          <w:tcPr>
+            <w:tcW w:type="dxa" w:w="1577"/>
+            <w:tcBorders>
+              <w:top w:val="single" w:color="8EA9DB" w:sz="4"/>
+              <w:left w:val="single" w:color="8EA9DB" w:sz="4"/>
+              <w:bottom w:val="single" w:color="8EA9DB" w:sz="4"/>
+              <w:right w:val="single" w:color="8EA9DB" w:sz="4"/>
+            </w:tcBorders>
+            <w:tcMar>
+              <w:top w:type="dxa" w:w="60"/>
+              <w:left w:type="dxa" w:w="100"/>
+              <w:bottom w:type="dxa" w:w="60"/>
+              <w:right w:type="dxa" w:w="100"/>
+            </w:tcMar>
+          </w:tcPr>
+          <w:p>
+            <w:pPr>
+              <w:spacing w:after="20"/>
+            </w:pPr>
+            <w:r>
+              <w:rPr>
+                <w:sz w:val="19"/>
+                <w:szCs w:val="19"/>
+              </w:rPr>
               <w:t xml:space="preserve">Base — unidade (fórmulas)</w:t>
             </w:r>
           </w:p>
@@ -27926,10 +28473,71 @@
           <w:b/>
           <w:bCs/>
         </w:rPr>
-        <w:t xml:space="preserve">Total: 64 testes, 38 deles na base da pirâmide (59%).</w:t>
-      </w:r>
-      <w:r>
-        <w:t xml:space="preserve"> Todos passam em cerca de 2,5 segundos.</w:t>
+        <w:t xml:space="preserve">Total: 83 testes automatizados, 38 deles na base da pirâmide, e 99% de cobertura de código</w:t>
+      </w:r>
+      <w:r>
+        <w:t xml:space="preserve"> (medida com coverage.py). Todos passam em cerca de 13 segundos, inclusive executados em ordem aleatória (</w:t>
+      </w:r>
+      <w:r>
+        <w:rPr>
+          <w:rFonts w:ascii="Consolas" w:cs="Consolas" w:eastAsia="Consolas" w:hAnsi="Consolas"/>
+          <w:sz w:val="20"/>
+          <w:szCs w:val="20"/>
+        </w:rPr>
+        <w:t xml:space="preserve">--shuffle</w:t>
+      </w:r>
+      <w:r>
+        <w:t xml:space="preserve">), o que mostra que um teste não depende do outro.</w:t>
+      </w:r>
+    </w:p>
+    <w:p>
+      <w:pPr>
+        <w:spacing w:after="120" w:line="360"/>
+        <w:jc w:val="both"/>
+      </w:pPr>
+      <w:r>
+        <w:t xml:space="preserve">Além dos testes automatizados, foram feitos: </w:t>
+      </w:r>
+      <w:r>
+        <w:rPr>
+          <w:b/>
+          <w:bCs/>
+        </w:rPr>
+        <w:t xml:space="preserve">testes exploratórios</w:t>
+      </w:r>
+      <w:r>
+        <w:t xml:space="preserve"> com entradas inválidas em todas as telas (datas no passado, campos vazios, textos em campos numéricos, identificadores inexistentes, CPF e placa com pontuação); </w:t>
+      </w:r>
+      <w:r>
+        <w:rPr>
+          <w:b/>
+          <w:bCs/>
+        </w:rPr>
+        <w:t xml:space="preserve">teste de regressão</w:t>
+      </w:r>
+      <w:r>
+        <w:t xml:space="preserve">, rodando os testes novos contra o código antigo para confirmar que cada um detecta o defeito que protege; e </w:t>
+      </w:r>
+      <w:r>
+        <w:rPr>
+          <w:b/>
+          <w:bCs/>
+        </w:rPr>
+        <w:t xml:space="preserve">verificação de segurança</w:t>
+      </w:r>
+      <w:r>
+        <w:t xml:space="preserve"> (</w:t>
+      </w:r>
+      <w:r>
+        <w:rPr>
+          <w:rFonts w:ascii="Consolas" w:cs="Consolas" w:eastAsia="Consolas" w:hAnsi="Consolas"/>
+          <w:sz w:val="20"/>
+          <w:szCs w:val="20"/>
+        </w:rPr>
+        <w:t xml:space="preserve">manage.py check --deploy</w:t>
+      </w:r>
+      <w:r>
+        <w:t xml:space="preserve">, login obrigatório em todas as rotas, proteção CSRF e escape de HTML).</w:t>
       </w:r>
     </w:p>
     <w:p>
@@ -27954,10 +28562,21 @@
           <w:b/>
           <w:bCs/>
         </w:rPr>
-        <w:t xml:space="preserve">Testes de interface no navegador real</w:t>
-      </w:r>
-      <w:r>
-        <w:t xml:space="preserve"> (Selenium/Playwright): substituídos pelo cliente de testes do Django; as telas foram verificadas manualmente e capturadas no protótipo de alta fidelidade.</w:t>
+        <w:t xml:space="preserve">Testes de carga e concorrência real</w:t>
+      </w:r>
+      <w:r>
+        <w:t xml:space="preserve">: a proteção por </w:t>
+      </w:r>
+      <w:r>
+        <w:rPr>
+          <w:rFonts w:ascii="Consolas" w:cs="Consolas" w:eastAsia="Consolas" w:hAnsi="Consolas"/>
+          <w:sz w:val="20"/>
+          <w:szCs w:val="20"/>
+        </w:rPr>
+        <w:t xml:space="preserve">select_for_update</w:t>
+      </w:r>
+      <w:r>
+        <w:t xml:space="preserve"> só tem efeito pleno em PostgreSQL; com SQLite as escritas já são serializadas.</w:t>
       </w:r>
     </w:p>
     <w:p>
@@ -27974,21 +28593,10 @@
           <w:b/>
           <w:bCs/>
         </w:rPr>
-        <w:t xml:space="preserve">Testes de carga e concorrência real</w:t>
-      </w:r>
-      <w:r>
-        <w:t xml:space="preserve">: a proteção por </w:t>
-      </w:r>
-      <w:r>
-        <w:rPr>
-          <w:rFonts w:ascii="Consolas" w:cs="Consolas" w:eastAsia="Consolas" w:hAnsi="Consolas"/>
-          <w:sz w:val="20"/>
-          <w:szCs w:val="20"/>
-        </w:rPr>
-        <w:t xml:space="preserve">select_for_update</w:t>
-      </w:r>
-      <w:r>
-        <w:t xml:space="preserve"> só tem efeito pleno em PostgreSQL; com SQLite as escritas já são serializadas.</w:t>
+        <w:t xml:space="preserve">Testes de usabilidade com usuários finais</w:t>
+      </w:r>
+      <w:r>
+        <w:t xml:space="preserve"> e testes de acessibilidade automatizados.</w:t>
       </w:r>
     </w:p>
     <w:p>
@@ -28005,10 +28613,2341 @@
           <w:b/>
           <w:bCs/>
         </w:rPr>
-        <w:t xml:space="preserve">Testes de usabilidade com usuários finais</w:t>
-      </w:r>
-      <w:r>
-        <w:t xml:space="preserve"> e testes de acessibilidade automatizados.</w:t>
+        <w:t xml:space="preserve">Configurações de HTTPS</w:t>
+      </w:r>
+      <w:r>
+        <w:t xml:space="preserve"> apontadas por </w:t>
+      </w:r>
+      <w:r>
+        <w:rPr>
+          <w:rFonts w:ascii="Consolas" w:cs="Consolas" w:eastAsia="Consolas" w:hAnsi="Consolas"/>
+          <w:sz w:val="20"/>
+          <w:szCs w:val="20"/>
+        </w:rPr>
+        <w:t xml:space="preserve">check --deploy</w:t>
+      </w:r>
+      <w:r>
+        <w:t xml:space="preserve"> (HSTS, cookies seguros, redirecionamento SSL): não se aplicam à execução local em http://127.0.0.1 e devem ser ativadas apenas numa publicação na internet.</w:t>
+      </w:r>
+    </w:p>
+    <w:p>
+      <w:pPr>
+        <w:pStyle w:val="Heading2"/>
+      </w:pPr>
+      <w:r>
+        <w:t xml:space="preserve">6.2 Execução</w:t>
+      </w:r>
+    </w:p>
+    <w:p>
+      <w:pPr>
+        <w:spacing w:after="120" w:line="360"/>
+        <w:jc w:val="both"/>
+      </w:pPr>
+      <w:r>
+        <w:t xml:space="preserve">Com o ambiente virtual ativado, na raiz do projeto:</w:t>
+      </w:r>
+    </w:p>
+    <w:p>
+      <w:pPr>
+        <w:shd w:fill="F2F2F2" w:color="auto" w:val="clear"/>
+        <w:spacing w:after="0" w:before="60"/>
+        <w:ind w:left="200" w:right="200"/>
+      </w:pPr>
+      <w:r>
+        <w:rPr>
+          <w:rFonts w:ascii="Consolas" w:cs="Consolas" w:eastAsia="Consolas" w:hAnsi="Consolas"/>
+          <w:sz w:val="18"/>
+          <w:szCs w:val="18"/>
+        </w:rPr>
+        <w:t xml:space="preserve">python manage.py test                          # todos os testes</w:t>
+      </w:r>
+    </w:p>
+    <w:p>
+      <w:pPr>
+        <w:shd w:fill="F2F2F2" w:color="auto" w:val="clear"/>
+        <w:spacing w:after="0" w:before="0"/>
+        <w:ind w:left="200" w:right="200"/>
+      </w:pPr>
+      <w:r>
+        <w:rPr>
+          <w:rFonts w:ascii="Consolas" w:cs="Consolas" w:eastAsia="Consolas" w:hAnsi="Consolas"/>
+          <w:sz w:val="18"/>
+          <w:szCs w:val="18"/>
+        </w:rPr>
+        <w:t xml:space="preserve">python manage.py test locacao.tests.test_services   # só as fórmulas</w:t>
+      </w:r>
+    </w:p>
+    <w:p>
+      <w:pPr>
+        <w:shd w:fill="F2F2F2" w:color="auto" w:val="clear"/>
+        <w:spacing w:after="0" w:before="0"/>
+        <w:ind w:left="200" w:right="200"/>
+      </w:pPr>
+      <w:r>
+        <w:rPr>
+          <w:rFonts w:ascii="Consolas" w:cs="Consolas" w:eastAsia="Consolas" w:hAnsi="Consolas"/>
+          <w:sz w:val="18"/>
+          <w:szCs w:val="18"/>
+        </w:rPr>
+        <w:t xml:space="preserve">python manage.py test locacao.tests.test_rules      # só as regras</w:t>
+      </w:r>
+    </w:p>
+    <w:p>
+      <w:pPr>
+        <w:shd w:fill="F2F2F2" w:color="auto" w:val="clear"/>
+        <w:spacing w:after="0" w:before="0"/>
+        <w:ind w:left="200" w:right="200"/>
+      </w:pPr>
+      <w:r>
+        <w:rPr>
+          <w:rFonts w:ascii="Consolas" w:cs="Consolas" w:eastAsia="Consolas" w:hAnsi="Consolas"/>
+          <w:sz w:val="18"/>
+          <w:szCs w:val="18"/>
+        </w:rPr>
+        <w:t xml:space="preserve">python manage.py test -v 2                     # lista cada teste executado</w:t>
+      </w:r>
+    </w:p>
+    <w:p>
+      <w:pPr>
+        <w:shd w:fill="F2F2F2" w:color="auto" w:val="clear"/>
+        <w:spacing w:after="0" w:before="0"/>
+        <w:ind w:left="200" w:right="200"/>
+      </w:pPr>
+      <w:r>
+        <w:rPr>
+          <w:rFonts w:ascii="Consolas" w:cs="Consolas" w:eastAsia="Consolas" w:hAnsi="Consolas"/>
+          <w:sz w:val="18"/>
+          <w:szCs w:val="18"/>
+        </w:rPr>
+        <w:t xml:space="preserve">python manage.py test --shuffle                # ordem aleatória</w:t>
+      </w:r>
+    </w:p>
+    <w:p>
+      <w:pPr>
+        <w:shd w:fill="F2F2F2" w:color="auto" w:val="clear"/>
+        <w:spacing w:after="0" w:before="0"/>
+        <w:ind w:left="200" w:right="200"/>
+      </w:pPr>
+      <w:r>
+        <w:rPr>
+          <w:rFonts w:ascii="Consolas" w:cs="Consolas" w:eastAsia="Consolas" w:hAnsi="Consolas"/>
+          <w:sz w:val="18"/>
+          <w:szCs w:val="18"/>
+        </w:rPr>
+        <w:t xml:space="preserve">pip install coverage                           # opcional: medir a cobertura</w:t>
+      </w:r>
+    </w:p>
+    <w:p>
+      <w:pPr>
+        <w:shd w:fill="F2F2F2" w:color="auto" w:val="clear"/>
+        <w:spacing w:after="160" w:before="0"/>
+        <w:ind w:left="200" w:right="200"/>
+      </w:pPr>
+      <w:r>
+        <w:rPr>
+          <w:rFonts w:ascii="Consolas" w:cs="Consolas" w:eastAsia="Consolas" w:hAnsi="Consolas"/>
+          <w:sz w:val="18"/>
+          <w:szCs w:val="18"/>
+        </w:rPr>
+        <w:t xml:space="preserve">coverage run --source=locacao manage.py test &amp;&amp; coverage report</w:t>
+      </w:r>
+    </w:p>
+    <w:p>
+      <w:pPr>
+        <w:spacing w:after="120" w:line="360"/>
+        <w:jc w:val="both"/>
+      </w:pPr>
+      <w:r>
+        <w:t xml:space="preserve">Saída esperada:</w:t>
+      </w:r>
+    </w:p>
+    <w:p>
+      <w:pPr>
+        <w:shd w:fill="F2F2F2" w:color="auto" w:val="clear"/>
+        <w:spacing w:after="0" w:before="60"/>
+        <w:ind w:left="200" w:right="200"/>
+      </w:pPr>
+      <w:r>
+        <w:rPr>
+          <w:rFonts w:ascii="Consolas" w:cs="Consolas" w:eastAsia="Consolas" w:hAnsi="Consolas"/>
+          <w:sz w:val="18"/>
+          <w:szCs w:val="18"/>
+        </w:rPr>
+        <w:t xml:space="preserve">Found 83 test(s).</w:t>
+      </w:r>
+    </w:p>
+    <w:p>
+      <w:pPr>
+        <w:shd w:fill="F2F2F2" w:color="auto" w:val="clear"/>
+        <w:spacing w:after="0" w:before="0"/>
+        <w:ind w:left="200" w:right="200"/>
+      </w:pPr>
+      <w:r>
+        <w:rPr>
+          <w:rFonts w:ascii="Consolas" w:cs="Consolas" w:eastAsia="Consolas" w:hAnsi="Consolas"/>
+          <w:sz w:val="18"/>
+          <w:szCs w:val="18"/>
+        </w:rPr>
+        <w:t xml:space="preserve">Creating test database for alias 'default'...</w:t>
+      </w:r>
+    </w:p>
+    <w:p>
+      <w:pPr>
+        <w:shd w:fill="F2F2F2" w:color="auto" w:val="clear"/>
+        <w:spacing w:after="0" w:before="0"/>
+        <w:ind w:left="200" w:right="200"/>
+      </w:pPr>
+      <w:r>
+        <w:rPr>
+          <w:rFonts w:ascii="Consolas" w:cs="Consolas" w:eastAsia="Consolas" w:hAnsi="Consolas"/>
+          <w:sz w:val="18"/>
+          <w:szCs w:val="18"/>
+        </w:rPr>
+        <w:t xml:space="preserve">System check identified no issues (0 silenced).</w:t>
+      </w:r>
+    </w:p>
+    <w:p>
+      <w:pPr>
+        <w:shd w:fill="F2F2F2" w:color="auto" w:val="clear"/>
+        <w:spacing w:after="0" w:before="0"/>
+        <w:ind w:left="200" w:right="200"/>
+      </w:pPr>
+      <w:r>
+        <w:rPr>
+          <w:rFonts w:ascii="Consolas" w:cs="Consolas" w:eastAsia="Consolas" w:hAnsi="Consolas"/>
+          <w:sz w:val="18"/>
+          <w:szCs w:val="18"/>
+        </w:rPr>
+        <w:t xml:space="preserve">...................................................................................</w:t>
+      </w:r>
+    </w:p>
+    <w:p>
+      <w:pPr>
+        <w:shd w:fill="F2F2F2" w:color="auto" w:val="clear"/>
+        <w:spacing w:after="0" w:before="0"/>
+        <w:ind w:left="200" w:right="200"/>
+      </w:pPr>
+      <w:r>
+        <w:rPr>
+          <w:rFonts w:ascii="Consolas" w:cs="Consolas" w:eastAsia="Consolas" w:hAnsi="Consolas"/>
+          <w:sz w:val="18"/>
+          <w:szCs w:val="18"/>
+        </w:rPr>
+        <w:t xml:space="preserve">----------------------------------------------------------------------</w:t>
+      </w:r>
+    </w:p>
+    <w:p>
+      <w:pPr>
+        <w:shd w:fill="F2F2F2" w:color="auto" w:val="clear"/>
+        <w:spacing w:after="0" w:before="0"/>
+        <w:ind w:left="200" w:right="200"/>
+      </w:pPr>
+      <w:r>
+        <w:rPr>
+          <w:rFonts w:ascii="Consolas" w:cs="Consolas" w:eastAsia="Consolas" w:hAnsi="Consolas"/>
+          <w:sz w:val="18"/>
+          <w:szCs w:val="18"/>
+        </w:rPr>
+        <w:t xml:space="preserve">Ran 83 tests in 13.2s</w:t>
+      </w:r>
+    </w:p>
+    <w:p>
+      <w:pPr>
+        <w:shd w:fill="F2F2F2" w:color="auto" w:val="clear"/>
+        <w:spacing w:after="0" w:before="0"/>
+        <w:ind w:left="200" w:right="200"/>
+      </w:pPr>
+      <w:r>
+        <w:rPr>
+          <w:rFonts w:ascii="Consolas" w:cs="Consolas" w:eastAsia="Consolas" w:hAnsi="Consolas"/>
+          <w:sz w:val="18"/>
+          <w:szCs w:val="18"/>
+        </w:rPr>
+        <w:t xml:space="preserve"> </w:t>
+      </w:r>
+    </w:p>
+    <w:p>
+      <w:pPr>
+        <w:shd w:fill="F2F2F2" w:color="auto" w:val="clear"/>
+        <w:spacing w:after="160" w:before="0"/>
+        <w:ind w:left="200" w:right="200"/>
+      </w:pPr>
+      <w:r>
+        <w:rPr>
+          <w:rFonts w:ascii="Consolas" w:cs="Consolas" w:eastAsia="Consolas" w:hAnsi="Consolas"/>
+          <w:sz w:val="18"/>
+          <w:szCs w:val="18"/>
+        </w:rPr>
+        <w:t xml:space="preserve">OK</w:t>
+      </w:r>
+    </w:p>
+    <w:p>
+      <w:pPr>
+        <w:spacing w:after="120" w:line="360"/>
+        <w:jc w:val="both"/>
+      </w:pPr>
+      <w:r>
+        <w:t xml:space="preserve">O banco de testes é criado e destruído automaticamente; os dados de desenvolvimento (</w:t>
+      </w:r>
+      <w:r>
+        <w:rPr>
+          <w:rFonts w:ascii="Consolas" w:cs="Consolas" w:eastAsia="Consolas" w:hAnsi="Consolas"/>
+          <w:sz w:val="20"/>
+          <w:szCs w:val="20"/>
+        </w:rPr>
+        <w:t xml:space="preserve">db.sqlite3</w:t>
+      </w:r>
+      <w:r>
+        <w:t xml:space="preserve">) não são afetados. Os testes devem ser executados antes de cada commit e de cada Pull Request.</w:t>
+      </w:r>
+    </w:p>
+    <w:p>
+      <w:pPr>
+        <w:pStyle w:val="Heading2"/>
+      </w:pPr>
+      <w:r>
+        <w:t xml:space="preserve">6.3 Teste de sistema (aceitação no navegador)</w:t>
+      </w:r>
+    </w:p>
+    <w:p>
+      <w:pPr>
+        <w:spacing w:after="120" w:line="360"/>
+        <w:jc w:val="both"/>
+      </w:pPr>
+      <w:r>
+        <w:t xml:space="preserve">Roteiro executado no navegador Chromium, com o servidor rodando (</w:t>
+      </w:r>
+      <w:r>
+        <w:rPr>
+          <w:rFonts w:ascii="Consolas" w:cs="Consolas" w:eastAsia="Consolas" w:hAnsi="Consolas"/>
+          <w:sz w:val="20"/>
+          <w:szCs w:val="20"/>
+        </w:rPr>
+        <w:t xml:space="preserve">runserver</w:t>
+      </w:r>
+      <w:r>
+        <w:t xml:space="preserve">) e os dados do </w:t>
+      </w:r>
+      <w:r>
+        <w:rPr>
+          <w:rFonts w:ascii="Consolas" w:cs="Consolas" w:eastAsia="Consolas" w:hAnsi="Consolas"/>
+          <w:sz w:val="20"/>
+          <w:szCs w:val="20"/>
+        </w:rPr>
+        <w:t xml:space="preserve">seed</w:t>
+      </w:r>
+      <w:r>
+        <w:t xml:space="preserve">, cobrindo os cinco casos de uso de ponta a ponta. Pode ser repetido manualmente pelo avaliador seguindo a mesma sequência.</w:t>
+      </w:r>
+    </w:p>
+    <w:p>
+      <w:pPr>
+        <w:keepNext/>
+        <w:spacing w:after="80" w:before="200"/>
+        <w:jc w:val="center"/>
+      </w:pPr>
+      <w:r>
+        <w:rPr>
+          <w:b/>
+          <w:bCs/>
+          <w:sz w:val="20"/>
+          <w:szCs w:val="20"/>
+        </w:rPr>
+        <w:t xml:space="preserve">Tabela 34 — Roteiro de teste de sistema e resultado</w:t>
+      </w:r>
+    </w:p>
+    <w:tbl>
+      <w:tblPr>
+        <w:tblW w:type="dxa" w:w="9071"/>
+        <w:tblBorders>
+          <w:top w:val="single" w:color="auto" w:sz="4"/>
+          <w:left w:val="single" w:color="auto" w:sz="4"/>
+          <w:bottom w:val="single" w:color="auto" w:sz="4"/>
+          <w:right w:val="single" w:color="auto" w:sz="4"/>
+          <w:insideH w:val="single" w:color="auto" w:sz="4"/>
+          <w:insideV w:val="single" w:color="auto" w:sz="4"/>
+        </w:tblBorders>
+      </w:tblPr>
+      <w:tblGrid>
+        <w:gridCol w:w="735"/>
+        <w:gridCol w:w="3677"/>
+        <w:gridCol w:w="3677"/>
+        <w:gridCol w:w="982"/>
+      </w:tblGrid>
+      <w:tr>
+        <w:trPr>
+          <w:tblHeader/>
+        </w:trPr>
+        <w:tc>
+          <w:tcPr>
+            <w:tcW w:type="dxa" w:w="735"/>
+            <w:tcBorders>
+              <w:top w:val="single" w:color="8EA9DB" w:sz="4"/>
+              <w:left w:val="single" w:color="8EA9DB" w:sz="4"/>
+              <w:bottom w:val="single" w:color="8EA9DB" w:sz="4"/>
+              <w:right w:val="single" w:color="8EA9DB" w:sz="4"/>
+            </w:tcBorders>
+            <w:shd w:fill="D9E2F3" w:color="auto" w:val="clear"/>
+            <w:tcMar>
+              <w:top w:type="dxa" w:w="60"/>
+              <w:left w:type="dxa" w:w="100"/>
+              <w:bottom w:type="dxa" w:w="60"/>
+              <w:right w:type="dxa" w:w="100"/>
+            </w:tcMar>
+          </w:tcPr>
+          <w:p>
+            <w:pPr>
+              <w:spacing w:after="20"/>
+            </w:pPr>
+            <w:r>
+              <w:rPr>
+                <w:b/>
+                <w:bCs/>
+                <w:sz w:val="19"/>
+                <w:szCs w:val="19"/>
+              </w:rPr>
+              <w:t xml:space="preserve">Passo</w:t>
+            </w:r>
+          </w:p>
+        </w:tc>
+        <w:tc>
+          <w:tcPr>
+            <w:tcW w:type="dxa" w:w="3677"/>
+            <w:tcBorders>
+              <w:top w:val="single" w:color="8EA9DB" w:sz="4"/>
+              <w:left w:val="single" w:color="8EA9DB" w:sz="4"/>
+              <w:bottom w:val="single" w:color="8EA9DB" w:sz="4"/>
+              <w:right w:val="single" w:color="8EA9DB" w:sz="4"/>
+            </w:tcBorders>
+            <w:shd w:fill="D9E2F3" w:color="auto" w:val="clear"/>
+            <w:tcMar>
+              <w:top w:type="dxa" w:w="60"/>
+              <w:left w:type="dxa" w:w="100"/>
+              <w:bottom w:type="dxa" w:w="60"/>
+              <w:right w:type="dxa" w:w="100"/>
+            </w:tcMar>
+          </w:tcPr>
+          <w:p>
+            <w:pPr>
+              <w:spacing w:after="20"/>
+            </w:pPr>
+            <w:r>
+              <w:rPr>
+                <w:b/>
+                <w:bCs/>
+                <w:sz w:val="19"/>
+                <w:szCs w:val="19"/>
+              </w:rPr>
+              <w:t xml:space="preserve">Ação</w:t>
+            </w:r>
+          </w:p>
+        </w:tc>
+        <w:tc>
+          <w:tcPr>
+            <w:tcW w:type="dxa" w:w="3677"/>
+            <w:tcBorders>
+              <w:top w:val="single" w:color="8EA9DB" w:sz="4"/>
+              <w:left w:val="single" w:color="8EA9DB" w:sz="4"/>
+              <w:bottom w:val="single" w:color="8EA9DB" w:sz="4"/>
+              <w:right w:val="single" w:color="8EA9DB" w:sz="4"/>
+            </w:tcBorders>
+            <w:shd w:fill="D9E2F3" w:color="auto" w:val="clear"/>
+            <w:tcMar>
+              <w:top w:type="dxa" w:w="60"/>
+              <w:left w:type="dxa" w:w="100"/>
+              <w:bottom w:type="dxa" w:w="60"/>
+              <w:right w:type="dxa" w:w="100"/>
+            </w:tcMar>
+          </w:tcPr>
+          <w:p>
+            <w:pPr>
+              <w:spacing w:after="20"/>
+            </w:pPr>
+            <w:r>
+              <w:rPr>
+                <w:b/>
+                <w:bCs/>
+                <w:sz w:val="19"/>
+                <w:szCs w:val="19"/>
+              </w:rPr>
+              <w:t xml:space="preserve">Resultado esperado</w:t>
+            </w:r>
+          </w:p>
+        </w:tc>
+        <w:tc>
+          <w:tcPr>
+            <w:tcW w:type="dxa" w:w="982"/>
+            <w:tcBorders>
+              <w:top w:val="single" w:color="8EA9DB" w:sz="4"/>
+              <w:left w:val="single" w:color="8EA9DB" w:sz="4"/>
+              <w:bottom w:val="single" w:color="8EA9DB" w:sz="4"/>
+              <w:right w:val="single" w:color="8EA9DB" w:sz="4"/>
+            </w:tcBorders>
+            <w:shd w:fill="D9E2F3" w:color="auto" w:val="clear"/>
+            <w:tcMar>
+              <w:top w:type="dxa" w:w="60"/>
+              <w:left w:type="dxa" w:w="100"/>
+              <w:bottom w:type="dxa" w:w="60"/>
+              <w:right w:type="dxa" w:w="100"/>
+            </w:tcMar>
+          </w:tcPr>
+          <w:p>
+            <w:pPr>
+              <w:spacing w:after="20"/>
+            </w:pPr>
+            <w:r>
+              <w:rPr>
+                <w:b/>
+                <w:bCs/>
+                <w:sz w:val="19"/>
+                <w:szCs w:val="19"/>
+              </w:rPr>
+              <w:t xml:space="preserve">Resultado</w:t>
+            </w:r>
+          </w:p>
+        </w:tc>
+      </w:tr>
+      <w:tr>
+        <w:trPr>
+          <w:cantSplit/>
+        </w:trPr>
+        <w:tc>
+          <w:tcPr>
+            <w:tcW w:type="dxa" w:w="735"/>
+            <w:tcBorders>
+              <w:top w:val="single" w:color="8EA9DB" w:sz="4"/>
+              <w:left w:val="single" w:color="8EA9DB" w:sz="4"/>
+              <w:bottom w:val="single" w:color="8EA9DB" w:sz="4"/>
+              <w:right w:val="single" w:color="8EA9DB" w:sz="4"/>
+            </w:tcBorders>
+            <w:tcMar>
+              <w:top w:type="dxa" w:w="60"/>
+              <w:left w:type="dxa" w:w="100"/>
+              <w:bottom w:type="dxa" w:w="60"/>
+              <w:right w:type="dxa" w:w="100"/>
+            </w:tcMar>
+          </w:tcPr>
+          <w:p>
+            <w:pPr>
+              <w:spacing w:after="20"/>
+            </w:pPr>
+            <w:r>
+              <w:rPr>
+                <w:sz w:val="19"/>
+                <w:szCs w:val="19"/>
+              </w:rPr>
+              <w:t xml:space="preserve">1</w:t>
+            </w:r>
+          </w:p>
+        </w:tc>
+        <w:tc>
+          <w:tcPr>
+            <w:tcW w:type="dxa" w:w="3677"/>
+            <w:tcBorders>
+              <w:top w:val="single" w:color="8EA9DB" w:sz="4"/>
+              <w:left w:val="single" w:color="8EA9DB" w:sz="4"/>
+              <w:bottom w:val="single" w:color="8EA9DB" w:sz="4"/>
+              <w:right w:val="single" w:color="8EA9DB" w:sz="4"/>
+            </w:tcBorders>
+            <w:tcMar>
+              <w:top w:type="dxa" w:w="60"/>
+              <w:left w:type="dxa" w:w="100"/>
+              <w:bottom w:type="dxa" w:w="60"/>
+              <w:right w:type="dxa" w:w="100"/>
+            </w:tcMar>
+          </w:tcPr>
+          <w:p>
+            <w:pPr>
+              <w:spacing w:after="20"/>
+            </w:pPr>
+            <w:r>
+              <w:rPr>
+                <w:sz w:val="19"/>
+                <w:szCs w:val="19"/>
+              </w:rPr>
+              <w:t xml:space="preserve">Abrir o sistema sem login; entrar com senha errada; entrar com atendente/locadora123</w:t>
+            </w:r>
+          </w:p>
+        </w:tc>
+        <w:tc>
+          <w:tcPr>
+            <w:tcW w:type="dxa" w:w="3677"/>
+            <w:tcBorders>
+              <w:top w:val="single" w:color="8EA9DB" w:sz="4"/>
+              <w:left w:val="single" w:color="8EA9DB" w:sz="4"/>
+              <w:bottom w:val="single" w:color="8EA9DB" w:sz="4"/>
+              <w:right w:val="single" w:color="8EA9DB" w:sz="4"/>
+            </w:tcBorders>
+            <w:tcMar>
+              <w:top w:type="dxa" w:w="60"/>
+              <w:left w:type="dxa" w:w="100"/>
+              <w:bottom w:type="dxa" w:w="60"/>
+              <w:right w:type="dxa" w:w="100"/>
+            </w:tcMar>
+          </w:tcPr>
+          <w:p>
+            <w:pPr>
+              <w:spacing w:after="20"/>
+            </w:pPr>
+            <w:r>
+              <w:rPr>
+                <w:sz w:val="19"/>
+                <w:szCs w:val="19"/>
+              </w:rPr>
+              <w:t xml:space="preserve">Redireciona ao login; mostra “Usuário ou senha inválidos”; abre o painel com 5 indicadores</w:t>
+            </w:r>
+          </w:p>
+        </w:tc>
+        <w:tc>
+          <w:tcPr>
+            <w:tcW w:type="dxa" w:w="982"/>
+            <w:tcBorders>
+              <w:top w:val="single" w:color="8EA9DB" w:sz="4"/>
+              <w:left w:val="single" w:color="8EA9DB" w:sz="4"/>
+              <w:bottom w:val="single" w:color="8EA9DB" w:sz="4"/>
+              <w:right w:val="single" w:color="8EA9DB" w:sz="4"/>
+            </w:tcBorders>
+            <w:tcMar>
+              <w:top w:type="dxa" w:w="60"/>
+              <w:left w:type="dxa" w:w="100"/>
+              <w:bottom w:type="dxa" w:w="60"/>
+              <w:right w:type="dxa" w:w="100"/>
+            </w:tcMar>
+          </w:tcPr>
+          <w:p>
+            <w:pPr>
+              <w:spacing w:after="20"/>
+            </w:pPr>
+            <w:r>
+              <w:rPr>
+                <w:sz w:val="19"/>
+                <w:szCs w:val="19"/>
+              </w:rPr>
+              <w:t xml:space="preserve">OK</w:t>
+            </w:r>
+          </w:p>
+        </w:tc>
+      </w:tr>
+      <w:tr>
+        <w:trPr>
+          <w:cantSplit/>
+        </w:trPr>
+        <w:tc>
+          <w:tcPr>
+            <w:tcW w:type="dxa" w:w="735"/>
+            <w:tcBorders>
+              <w:top w:val="single" w:color="8EA9DB" w:sz="4"/>
+              <w:left w:val="single" w:color="8EA9DB" w:sz="4"/>
+              <w:bottom w:val="single" w:color="8EA9DB" w:sz="4"/>
+              <w:right w:val="single" w:color="8EA9DB" w:sz="4"/>
+            </w:tcBorders>
+            <w:tcMar>
+              <w:top w:type="dxa" w:w="60"/>
+              <w:left w:type="dxa" w:w="100"/>
+              <w:bottom w:type="dxa" w:w="60"/>
+              <w:right w:type="dxa" w:w="100"/>
+            </w:tcMar>
+          </w:tcPr>
+          <w:p>
+            <w:pPr>
+              <w:spacing w:after="20"/>
+            </w:pPr>
+            <w:r>
+              <w:rPr>
+                <w:sz w:val="19"/>
+                <w:szCs w:val="19"/>
+              </w:rPr>
+              <w:t xml:space="preserve">2</w:t>
+            </w:r>
+          </w:p>
+        </w:tc>
+        <w:tc>
+          <w:tcPr>
+            <w:tcW w:type="dxa" w:w="3677"/>
+            <w:tcBorders>
+              <w:top w:val="single" w:color="8EA9DB" w:sz="4"/>
+              <w:left w:val="single" w:color="8EA9DB" w:sz="4"/>
+              <w:bottom w:val="single" w:color="8EA9DB" w:sz="4"/>
+              <w:right w:val="single" w:color="8EA9DB" w:sz="4"/>
+            </w:tcBorders>
+            <w:tcMar>
+              <w:top w:type="dxa" w:w="60"/>
+              <w:left w:type="dxa" w:w="100"/>
+              <w:bottom w:type="dxa" w:w="60"/>
+              <w:right w:type="dxa" w:w="100"/>
+            </w:tcMar>
+          </w:tcPr>
+          <w:p>
+            <w:pPr>
+              <w:spacing w:after="20"/>
+            </w:pPr>
+            <w:r>
+              <w:rPr>
+                <w:sz w:val="19"/>
+                <w:szCs w:val="19"/>
+              </w:rPr>
+              <w:t xml:space="preserve">UC02: cadastrar cliente com CPF 935.411.347-80 (com pontuação)</w:t>
+            </w:r>
+          </w:p>
+        </w:tc>
+        <w:tc>
+          <w:tcPr>
+            <w:tcW w:type="dxa" w:w="3677"/>
+            <w:tcBorders>
+              <w:top w:val="single" w:color="8EA9DB" w:sz="4"/>
+              <w:left w:val="single" w:color="8EA9DB" w:sz="4"/>
+              <w:bottom w:val="single" w:color="8EA9DB" w:sz="4"/>
+              <w:right w:val="single" w:color="8EA9DB" w:sz="4"/>
+            </w:tcBorders>
+            <w:tcMar>
+              <w:top w:type="dxa" w:w="60"/>
+              <w:left w:type="dxa" w:w="100"/>
+              <w:bottom w:type="dxa" w:w="60"/>
+              <w:right w:type="dxa" w:w="100"/>
+            </w:tcMar>
+          </w:tcPr>
+          <w:p>
+            <w:pPr>
+              <w:spacing w:after="20"/>
+            </w:pPr>
+            <w:r>
+              <w:rPr>
+                <w:sz w:val="19"/>
+                <w:szCs w:val="19"/>
+              </w:rPr>
+              <w:t xml:space="preserve">“Cliente salvo com sucesso”</w:t>
+            </w:r>
+          </w:p>
+        </w:tc>
+        <w:tc>
+          <w:tcPr>
+            <w:tcW w:type="dxa" w:w="982"/>
+            <w:tcBorders>
+              <w:top w:val="single" w:color="8EA9DB" w:sz="4"/>
+              <w:left w:val="single" w:color="8EA9DB" w:sz="4"/>
+              <w:bottom w:val="single" w:color="8EA9DB" w:sz="4"/>
+              <w:right w:val="single" w:color="8EA9DB" w:sz="4"/>
+            </w:tcBorders>
+            <w:tcMar>
+              <w:top w:type="dxa" w:w="60"/>
+              <w:left w:type="dxa" w:w="100"/>
+              <w:bottom w:type="dxa" w:w="60"/>
+              <w:right w:type="dxa" w:w="100"/>
+            </w:tcMar>
+          </w:tcPr>
+          <w:p>
+            <w:pPr>
+              <w:spacing w:after="20"/>
+            </w:pPr>
+            <w:r>
+              <w:rPr>
+                <w:sz w:val="19"/>
+                <w:szCs w:val="19"/>
+              </w:rPr>
+              <w:t xml:space="preserve">OK</w:t>
+            </w:r>
+          </w:p>
+        </w:tc>
+      </w:tr>
+      <w:tr>
+        <w:trPr>
+          <w:cantSplit/>
+        </w:trPr>
+        <w:tc>
+          <w:tcPr>
+            <w:tcW w:type="dxa" w:w="735"/>
+            <w:tcBorders>
+              <w:top w:val="single" w:color="8EA9DB" w:sz="4"/>
+              <w:left w:val="single" w:color="8EA9DB" w:sz="4"/>
+              <w:bottom w:val="single" w:color="8EA9DB" w:sz="4"/>
+              <w:right w:val="single" w:color="8EA9DB" w:sz="4"/>
+            </w:tcBorders>
+            <w:tcMar>
+              <w:top w:type="dxa" w:w="60"/>
+              <w:left w:type="dxa" w:w="100"/>
+              <w:bottom w:type="dxa" w:w="60"/>
+              <w:right w:type="dxa" w:w="100"/>
+            </w:tcMar>
+          </w:tcPr>
+          <w:p>
+            <w:pPr>
+              <w:spacing w:after="20"/>
+            </w:pPr>
+            <w:r>
+              <w:rPr>
+                <w:sz w:val="19"/>
+                <w:szCs w:val="19"/>
+              </w:rPr>
+              <w:t xml:space="preserve">3</w:t>
+            </w:r>
+          </w:p>
+        </w:tc>
+        <w:tc>
+          <w:tcPr>
+            <w:tcW w:type="dxa" w:w="3677"/>
+            <w:tcBorders>
+              <w:top w:val="single" w:color="8EA9DB" w:sz="4"/>
+              <w:left w:val="single" w:color="8EA9DB" w:sz="4"/>
+              <w:bottom w:val="single" w:color="8EA9DB" w:sz="4"/>
+              <w:right w:val="single" w:color="8EA9DB" w:sz="4"/>
+            </w:tcBorders>
+            <w:tcMar>
+              <w:top w:type="dxa" w:w="60"/>
+              <w:left w:type="dxa" w:w="100"/>
+              <w:bottom w:type="dxa" w:w="60"/>
+              <w:right w:type="dxa" w:w="100"/>
+            </w:tcMar>
+          </w:tcPr>
+          <w:p>
+            <w:pPr>
+              <w:spacing w:after="20"/>
+            </w:pPr>
+            <w:r>
+              <w:rPr>
+                <w:sz w:val="19"/>
+                <w:szCs w:val="19"/>
+              </w:rPr>
+              <w:t xml:space="preserve">UC01: cadastrar veículo com placa “tst-9e99”</w:t>
+            </w:r>
+          </w:p>
+        </w:tc>
+        <w:tc>
+          <w:tcPr>
+            <w:tcW w:type="dxa" w:w="3677"/>
+            <w:tcBorders>
+              <w:top w:val="single" w:color="8EA9DB" w:sz="4"/>
+              <w:left w:val="single" w:color="8EA9DB" w:sz="4"/>
+              <w:bottom w:val="single" w:color="8EA9DB" w:sz="4"/>
+              <w:right w:val="single" w:color="8EA9DB" w:sz="4"/>
+            </w:tcBorders>
+            <w:tcMar>
+              <w:top w:type="dxa" w:w="60"/>
+              <w:left w:type="dxa" w:w="100"/>
+              <w:bottom w:type="dxa" w:w="60"/>
+              <w:right w:type="dxa" w:w="100"/>
+            </w:tcMar>
+          </w:tcPr>
+          <w:p>
+            <w:pPr>
+              <w:spacing w:after="20"/>
+            </w:pPr>
+            <w:r>
+              <w:rPr>
+                <w:sz w:val="19"/>
+                <w:szCs w:val="19"/>
+              </w:rPr>
+              <w:t xml:space="preserve">Veículo salvo com placa TST9E99</w:t>
+            </w:r>
+          </w:p>
+        </w:tc>
+        <w:tc>
+          <w:tcPr>
+            <w:tcW w:type="dxa" w:w="982"/>
+            <w:tcBorders>
+              <w:top w:val="single" w:color="8EA9DB" w:sz="4"/>
+              <w:left w:val="single" w:color="8EA9DB" w:sz="4"/>
+              <w:bottom w:val="single" w:color="8EA9DB" w:sz="4"/>
+              <w:right w:val="single" w:color="8EA9DB" w:sz="4"/>
+            </w:tcBorders>
+            <w:tcMar>
+              <w:top w:type="dxa" w:w="60"/>
+              <w:left w:type="dxa" w:w="100"/>
+              <w:bottom w:type="dxa" w:w="60"/>
+              <w:right w:type="dxa" w:w="100"/>
+            </w:tcMar>
+          </w:tcPr>
+          <w:p>
+            <w:pPr>
+              <w:spacing w:after="20"/>
+            </w:pPr>
+            <w:r>
+              <w:rPr>
+                <w:sz w:val="19"/>
+                <w:szCs w:val="19"/>
+              </w:rPr>
+              <w:t xml:space="preserve">OK</w:t>
+            </w:r>
+          </w:p>
+        </w:tc>
+      </w:tr>
+      <w:tr>
+        <w:trPr>
+          <w:cantSplit/>
+        </w:trPr>
+        <w:tc>
+          <w:tcPr>
+            <w:tcW w:type="dxa" w:w="735"/>
+            <w:tcBorders>
+              <w:top w:val="single" w:color="8EA9DB" w:sz="4"/>
+              <w:left w:val="single" w:color="8EA9DB" w:sz="4"/>
+              <w:bottom w:val="single" w:color="8EA9DB" w:sz="4"/>
+              <w:right w:val="single" w:color="8EA9DB" w:sz="4"/>
+            </w:tcBorders>
+            <w:tcMar>
+              <w:top w:type="dxa" w:w="60"/>
+              <w:left w:type="dxa" w:w="100"/>
+              <w:bottom w:type="dxa" w:w="60"/>
+              <w:right w:type="dxa" w:w="100"/>
+            </w:tcMar>
+          </w:tcPr>
+          <w:p>
+            <w:pPr>
+              <w:spacing w:after="20"/>
+            </w:pPr>
+            <w:r>
+              <w:rPr>
+                <w:sz w:val="19"/>
+                <w:szCs w:val="19"/>
+              </w:rPr>
+              <w:t xml:space="preserve">4</w:t>
+            </w:r>
+          </w:p>
+        </w:tc>
+        <w:tc>
+          <w:tcPr>
+            <w:tcW w:type="dxa" w:w="3677"/>
+            <w:tcBorders>
+              <w:top w:val="single" w:color="8EA9DB" w:sz="4"/>
+              <w:left w:val="single" w:color="8EA9DB" w:sz="4"/>
+              <w:bottom w:val="single" w:color="8EA9DB" w:sz="4"/>
+              <w:right w:val="single" w:color="8EA9DB" w:sz="4"/>
+            </w:tcBorders>
+            <w:tcMar>
+              <w:top w:type="dxa" w:w="60"/>
+              <w:left w:type="dxa" w:w="100"/>
+              <w:bottom w:type="dxa" w:w="60"/>
+              <w:right w:type="dxa" w:w="100"/>
+            </w:tcMar>
+          </w:tcPr>
+          <w:p>
+            <w:pPr>
+              <w:spacing w:after="20"/>
+            </w:pPr>
+            <w:r>
+              <w:rPr>
+                <w:sz w:val="19"/>
+                <w:szCs w:val="19"/>
+              </w:rPr>
+              <w:t xml:space="preserve">UC03: buscar Econômico por 3 dias</w:t>
+            </w:r>
+          </w:p>
+        </w:tc>
+        <w:tc>
+          <w:tcPr>
+            <w:tcW w:type="dxa" w:w="3677"/>
+            <w:tcBorders>
+              <w:top w:val="single" w:color="8EA9DB" w:sz="4"/>
+              <w:left w:val="single" w:color="8EA9DB" w:sz="4"/>
+              <w:bottom w:val="single" w:color="8EA9DB" w:sz="4"/>
+              <w:right w:val="single" w:color="8EA9DB" w:sz="4"/>
+            </w:tcBorders>
+            <w:tcMar>
+              <w:top w:type="dxa" w:w="60"/>
+              <w:left w:type="dxa" w:w="100"/>
+              <w:bottom w:type="dxa" w:w="60"/>
+              <w:right w:type="dxa" w:w="100"/>
+            </w:tcMar>
+          </w:tcPr>
+          <w:p>
+            <w:pPr>
+              <w:spacing w:after="20"/>
+            </w:pPr>
+            <w:r>
+              <w:rPr>
+                <w:sz w:val="19"/>
+                <w:szCs w:val="19"/>
+              </w:rPr>
+              <w:t xml:space="preserve">Veículo novo listado, valor estimado R$ 360,00</w:t>
+            </w:r>
+          </w:p>
+        </w:tc>
+        <w:tc>
+          <w:tcPr>
+            <w:tcW w:type="dxa" w:w="982"/>
+            <w:tcBorders>
+              <w:top w:val="single" w:color="8EA9DB" w:sz="4"/>
+              <w:left w:val="single" w:color="8EA9DB" w:sz="4"/>
+              <w:bottom w:val="single" w:color="8EA9DB" w:sz="4"/>
+              <w:right w:val="single" w:color="8EA9DB" w:sz="4"/>
+            </w:tcBorders>
+            <w:tcMar>
+              <w:top w:type="dxa" w:w="60"/>
+              <w:left w:type="dxa" w:w="100"/>
+              <w:bottom w:type="dxa" w:w="60"/>
+              <w:right w:type="dxa" w:w="100"/>
+            </w:tcMar>
+          </w:tcPr>
+          <w:p>
+            <w:pPr>
+              <w:spacing w:after="20"/>
+            </w:pPr>
+            <w:r>
+              <w:rPr>
+                <w:sz w:val="19"/>
+                <w:szCs w:val="19"/>
+              </w:rPr>
+              <w:t xml:space="preserve">OK</w:t>
+            </w:r>
+          </w:p>
+        </w:tc>
+      </w:tr>
+      <w:tr>
+        <w:trPr>
+          <w:cantSplit/>
+        </w:trPr>
+        <w:tc>
+          <w:tcPr>
+            <w:tcW w:type="dxa" w:w="735"/>
+            <w:tcBorders>
+              <w:top w:val="single" w:color="8EA9DB" w:sz="4"/>
+              <w:left w:val="single" w:color="8EA9DB" w:sz="4"/>
+              <w:bottom w:val="single" w:color="8EA9DB" w:sz="4"/>
+              <w:right w:val="single" w:color="8EA9DB" w:sz="4"/>
+            </w:tcBorders>
+            <w:tcMar>
+              <w:top w:type="dxa" w:w="60"/>
+              <w:left w:type="dxa" w:w="100"/>
+              <w:bottom w:type="dxa" w:w="60"/>
+              <w:right w:type="dxa" w:w="100"/>
+            </w:tcMar>
+          </w:tcPr>
+          <w:p>
+            <w:pPr>
+              <w:spacing w:after="20"/>
+            </w:pPr>
+            <w:r>
+              <w:rPr>
+                <w:sz w:val="19"/>
+                <w:szCs w:val="19"/>
+              </w:rPr>
+              <w:t xml:space="preserve">5</w:t>
+            </w:r>
+          </w:p>
+        </w:tc>
+        <w:tc>
+          <w:tcPr>
+            <w:tcW w:type="dxa" w:w="3677"/>
+            <w:tcBorders>
+              <w:top w:val="single" w:color="8EA9DB" w:sz="4"/>
+              <w:left w:val="single" w:color="8EA9DB" w:sz="4"/>
+              <w:bottom w:val="single" w:color="8EA9DB" w:sz="4"/>
+              <w:right w:val="single" w:color="8EA9DB" w:sz="4"/>
+            </w:tcBorders>
+            <w:tcMar>
+              <w:top w:type="dxa" w:w="60"/>
+              <w:left w:type="dxa" w:w="100"/>
+              <w:bottom w:type="dxa" w:w="60"/>
+              <w:right w:type="dxa" w:w="100"/>
+            </w:tcMar>
+          </w:tcPr>
+          <w:p>
+            <w:pPr>
+              <w:spacing w:after="20"/>
+            </w:pPr>
+            <w:r>
+              <w:rPr>
+                <w:sz w:val="19"/>
+                <w:szCs w:val="19"/>
+              </w:rPr>
+              <w:t xml:space="preserve">UC03: reservar para o cliente novo</w:t>
+            </w:r>
+          </w:p>
+        </w:tc>
+        <w:tc>
+          <w:tcPr>
+            <w:tcW w:type="dxa" w:w="3677"/>
+            <w:tcBorders>
+              <w:top w:val="single" w:color="8EA9DB" w:sz="4"/>
+              <w:left w:val="single" w:color="8EA9DB" w:sz="4"/>
+              <w:bottom w:val="single" w:color="8EA9DB" w:sz="4"/>
+              <w:right w:val="single" w:color="8EA9DB" w:sz="4"/>
+            </w:tcBorders>
+            <w:tcMar>
+              <w:top w:type="dxa" w:w="60"/>
+              <w:left w:type="dxa" w:w="100"/>
+              <w:bottom w:type="dxa" w:w="60"/>
+              <w:right w:type="dxa" w:w="100"/>
+            </w:tcMar>
+          </w:tcPr>
+          <w:p>
+            <w:pPr>
+              <w:spacing w:after="20"/>
+            </w:pPr>
+            <w:r>
+              <w:rPr>
+                <w:sz w:val="19"/>
+                <w:szCs w:val="19"/>
+              </w:rPr>
+              <w:t xml:space="preserve">Reserva confirmada com código RES-AAAA-XXXXXX</w:t>
+            </w:r>
+          </w:p>
+        </w:tc>
+        <w:tc>
+          <w:tcPr>
+            <w:tcW w:type="dxa" w:w="982"/>
+            <w:tcBorders>
+              <w:top w:val="single" w:color="8EA9DB" w:sz="4"/>
+              <w:left w:val="single" w:color="8EA9DB" w:sz="4"/>
+              <w:bottom w:val="single" w:color="8EA9DB" w:sz="4"/>
+              <w:right w:val="single" w:color="8EA9DB" w:sz="4"/>
+            </w:tcBorders>
+            <w:tcMar>
+              <w:top w:type="dxa" w:w="60"/>
+              <w:left w:type="dxa" w:w="100"/>
+              <w:bottom w:type="dxa" w:w="60"/>
+              <w:right w:type="dxa" w:w="100"/>
+            </w:tcMar>
+          </w:tcPr>
+          <w:p>
+            <w:pPr>
+              <w:spacing w:after="20"/>
+            </w:pPr>
+            <w:r>
+              <w:rPr>
+                <w:sz w:val="19"/>
+                <w:szCs w:val="19"/>
+              </w:rPr>
+              <w:t xml:space="preserve">OK</w:t>
+            </w:r>
+          </w:p>
+        </w:tc>
+      </w:tr>
+      <w:tr>
+        <w:trPr>
+          <w:cantSplit/>
+        </w:trPr>
+        <w:tc>
+          <w:tcPr>
+            <w:tcW w:type="dxa" w:w="735"/>
+            <w:tcBorders>
+              <w:top w:val="single" w:color="8EA9DB" w:sz="4"/>
+              <w:left w:val="single" w:color="8EA9DB" w:sz="4"/>
+              <w:bottom w:val="single" w:color="8EA9DB" w:sz="4"/>
+              <w:right w:val="single" w:color="8EA9DB" w:sz="4"/>
+            </w:tcBorders>
+            <w:tcMar>
+              <w:top w:type="dxa" w:w="60"/>
+              <w:left w:type="dxa" w:w="100"/>
+              <w:bottom w:type="dxa" w:w="60"/>
+              <w:right w:type="dxa" w:w="100"/>
+            </w:tcMar>
+          </w:tcPr>
+          <w:p>
+            <w:pPr>
+              <w:spacing w:after="20"/>
+            </w:pPr>
+            <w:r>
+              <w:rPr>
+                <w:sz w:val="19"/>
+                <w:szCs w:val="19"/>
+              </w:rPr>
+              <w:t xml:space="preserve">6</w:t>
+            </w:r>
+          </w:p>
+        </w:tc>
+        <w:tc>
+          <w:tcPr>
+            <w:tcW w:type="dxa" w:w="3677"/>
+            <w:tcBorders>
+              <w:top w:val="single" w:color="8EA9DB" w:sz="4"/>
+              <w:left w:val="single" w:color="8EA9DB" w:sz="4"/>
+              <w:bottom w:val="single" w:color="8EA9DB" w:sz="4"/>
+              <w:right w:val="single" w:color="8EA9DB" w:sz="4"/>
+            </w:tcBorders>
+            <w:tcMar>
+              <w:top w:type="dxa" w:w="60"/>
+              <w:left w:type="dxa" w:w="100"/>
+              <w:bottom w:type="dxa" w:w="60"/>
+              <w:right w:type="dxa" w:w="100"/>
+            </w:tcMar>
+          </w:tcPr>
+          <w:p>
+            <w:pPr>
+              <w:spacing w:after="20"/>
+            </w:pPr>
+            <w:r>
+              <w:rPr>
+                <w:sz w:val="19"/>
+                <w:szCs w:val="19"/>
+              </w:rPr>
+              <w:t xml:space="preserve">RN06: repetir a mesma busca</w:t>
+            </w:r>
+          </w:p>
+        </w:tc>
+        <w:tc>
+          <w:tcPr>
+            <w:tcW w:type="dxa" w:w="3677"/>
+            <w:tcBorders>
+              <w:top w:val="single" w:color="8EA9DB" w:sz="4"/>
+              <w:left w:val="single" w:color="8EA9DB" w:sz="4"/>
+              <w:bottom w:val="single" w:color="8EA9DB" w:sz="4"/>
+              <w:right w:val="single" w:color="8EA9DB" w:sz="4"/>
+            </w:tcBorders>
+            <w:tcMar>
+              <w:top w:type="dxa" w:w="60"/>
+              <w:left w:type="dxa" w:w="100"/>
+              <w:bottom w:type="dxa" w:w="60"/>
+              <w:right w:type="dxa" w:w="100"/>
+            </w:tcMar>
+          </w:tcPr>
+          <w:p>
+            <w:pPr>
+              <w:spacing w:after="20"/>
+            </w:pPr>
+            <w:r>
+              <w:rPr>
+                <w:sz w:val="19"/>
+                <w:szCs w:val="19"/>
+              </w:rPr>
+              <w:t xml:space="preserve">Veículo reservado não aparece mais</w:t>
+            </w:r>
+          </w:p>
+        </w:tc>
+        <w:tc>
+          <w:tcPr>
+            <w:tcW w:type="dxa" w:w="982"/>
+            <w:tcBorders>
+              <w:top w:val="single" w:color="8EA9DB" w:sz="4"/>
+              <w:left w:val="single" w:color="8EA9DB" w:sz="4"/>
+              <w:bottom w:val="single" w:color="8EA9DB" w:sz="4"/>
+              <w:right w:val="single" w:color="8EA9DB" w:sz="4"/>
+            </w:tcBorders>
+            <w:tcMar>
+              <w:top w:type="dxa" w:w="60"/>
+              <w:left w:type="dxa" w:w="100"/>
+              <w:bottom w:type="dxa" w:w="60"/>
+              <w:right w:type="dxa" w:w="100"/>
+            </w:tcMar>
+          </w:tcPr>
+          <w:p>
+            <w:pPr>
+              <w:spacing w:after="20"/>
+            </w:pPr>
+            <w:r>
+              <w:rPr>
+                <w:sz w:val="19"/>
+                <w:szCs w:val="19"/>
+              </w:rPr>
+              <w:t xml:space="preserve">OK</w:t>
+            </w:r>
+          </w:p>
+        </w:tc>
+      </w:tr>
+      <w:tr>
+        <w:trPr>
+          <w:cantSplit/>
+        </w:trPr>
+        <w:tc>
+          <w:tcPr>
+            <w:tcW w:type="dxa" w:w="735"/>
+            <w:tcBorders>
+              <w:top w:val="single" w:color="8EA9DB" w:sz="4"/>
+              <w:left w:val="single" w:color="8EA9DB" w:sz="4"/>
+              <w:bottom w:val="single" w:color="8EA9DB" w:sz="4"/>
+              <w:right w:val="single" w:color="8EA9DB" w:sz="4"/>
+            </w:tcBorders>
+            <w:tcMar>
+              <w:top w:type="dxa" w:w="60"/>
+              <w:left w:type="dxa" w:w="100"/>
+              <w:bottom w:type="dxa" w:w="60"/>
+              <w:right w:type="dxa" w:w="100"/>
+            </w:tcMar>
+          </w:tcPr>
+          <w:p>
+            <w:pPr>
+              <w:spacing w:after="20"/>
+            </w:pPr>
+            <w:r>
+              <w:rPr>
+                <w:sz w:val="19"/>
+                <w:szCs w:val="19"/>
+              </w:rPr>
+              <w:t xml:space="preserve">7</w:t>
+            </w:r>
+          </w:p>
+        </w:tc>
+        <w:tc>
+          <w:tcPr>
+            <w:tcW w:type="dxa" w:w="3677"/>
+            <w:tcBorders>
+              <w:top w:val="single" w:color="8EA9DB" w:sz="4"/>
+              <w:left w:val="single" w:color="8EA9DB" w:sz="4"/>
+              <w:bottom w:val="single" w:color="8EA9DB" w:sz="4"/>
+              <w:right w:val="single" w:color="8EA9DB" w:sz="4"/>
+            </w:tcBorders>
+            <w:tcMar>
+              <w:top w:type="dxa" w:w="60"/>
+              <w:left w:type="dxa" w:w="100"/>
+              <w:bottom w:type="dxa" w:w="60"/>
+              <w:right w:type="dxa" w:w="100"/>
+            </w:tcMar>
+          </w:tcPr>
+          <w:p>
+            <w:pPr>
+              <w:spacing w:after="20"/>
+            </w:pPr>
+            <w:r>
+              <w:rPr>
+                <w:sz w:val="19"/>
+                <w:szCs w:val="19"/>
+              </w:rPr>
+              <w:t xml:space="preserve">UC04: registrar retirada com km menor que o do veículo; depois com o km correto</w:t>
+            </w:r>
+          </w:p>
+        </w:tc>
+        <w:tc>
+          <w:tcPr>
+            <w:tcW w:type="dxa" w:w="3677"/>
+            <w:tcBorders>
+              <w:top w:val="single" w:color="8EA9DB" w:sz="4"/>
+              <w:left w:val="single" w:color="8EA9DB" w:sz="4"/>
+              <w:bottom w:val="single" w:color="8EA9DB" w:sz="4"/>
+              <w:right w:val="single" w:color="8EA9DB" w:sz="4"/>
+            </w:tcBorders>
+            <w:tcMar>
+              <w:top w:type="dxa" w:w="60"/>
+              <w:left w:type="dxa" w:w="100"/>
+              <w:bottom w:type="dxa" w:w="60"/>
+              <w:right w:type="dxa" w:w="100"/>
+            </w:tcMar>
+          </w:tcPr>
+          <w:p>
+            <w:pPr>
+              <w:spacing w:after="20"/>
+            </w:pPr>
+            <w:r>
+              <w:rPr>
+                <w:sz w:val="19"/>
+                <w:szCs w:val="19"/>
+              </w:rPr>
+              <w:t xml:space="preserve">Erro RN14; depois “Retirada registrada”, locação Em andamento</w:t>
+            </w:r>
+          </w:p>
+        </w:tc>
+        <w:tc>
+          <w:tcPr>
+            <w:tcW w:type="dxa" w:w="982"/>
+            <w:tcBorders>
+              <w:top w:val="single" w:color="8EA9DB" w:sz="4"/>
+              <w:left w:val="single" w:color="8EA9DB" w:sz="4"/>
+              <w:bottom w:val="single" w:color="8EA9DB" w:sz="4"/>
+              <w:right w:val="single" w:color="8EA9DB" w:sz="4"/>
+            </w:tcBorders>
+            <w:tcMar>
+              <w:top w:type="dxa" w:w="60"/>
+              <w:left w:type="dxa" w:w="100"/>
+              <w:bottom w:type="dxa" w:w="60"/>
+              <w:right w:type="dxa" w:w="100"/>
+            </w:tcMar>
+          </w:tcPr>
+          <w:p>
+            <w:pPr>
+              <w:spacing w:after="20"/>
+            </w:pPr>
+            <w:r>
+              <w:rPr>
+                <w:sz w:val="19"/>
+                <w:szCs w:val="19"/>
+              </w:rPr>
+              <w:t xml:space="preserve">OK</w:t>
+            </w:r>
+          </w:p>
+        </w:tc>
+      </w:tr>
+      <w:tr>
+        <w:trPr>
+          <w:cantSplit/>
+        </w:trPr>
+        <w:tc>
+          <w:tcPr>
+            <w:tcW w:type="dxa" w:w="735"/>
+            <w:tcBorders>
+              <w:top w:val="single" w:color="8EA9DB" w:sz="4"/>
+              <w:left w:val="single" w:color="8EA9DB" w:sz="4"/>
+              <w:bottom w:val="single" w:color="8EA9DB" w:sz="4"/>
+              <w:right w:val="single" w:color="8EA9DB" w:sz="4"/>
+            </w:tcBorders>
+            <w:tcMar>
+              <w:top w:type="dxa" w:w="60"/>
+              <w:left w:type="dxa" w:w="100"/>
+              <w:bottom w:type="dxa" w:w="60"/>
+              <w:right w:type="dxa" w:w="100"/>
+            </w:tcMar>
+          </w:tcPr>
+          <w:p>
+            <w:pPr>
+              <w:spacing w:after="20"/>
+            </w:pPr>
+            <w:r>
+              <w:rPr>
+                <w:sz w:val="19"/>
+                <w:szCs w:val="19"/>
+              </w:rPr>
+              <w:t xml:space="preserve">8</w:t>
+            </w:r>
+          </w:p>
+        </w:tc>
+        <w:tc>
+          <w:tcPr>
+            <w:tcW w:type="dxa" w:w="3677"/>
+            <w:tcBorders>
+              <w:top w:val="single" w:color="8EA9DB" w:sz="4"/>
+              <w:left w:val="single" w:color="8EA9DB" w:sz="4"/>
+              <w:bottom w:val="single" w:color="8EA9DB" w:sz="4"/>
+              <w:right w:val="single" w:color="8EA9DB" w:sz="4"/>
+            </w:tcBorders>
+            <w:tcMar>
+              <w:top w:type="dxa" w:w="60"/>
+              <w:left w:type="dxa" w:w="100"/>
+              <w:bottom w:type="dxa" w:w="60"/>
+              <w:right w:type="dxa" w:w="100"/>
+            </w:tcMar>
+          </w:tcPr>
+          <w:p>
+            <w:pPr>
+              <w:spacing w:after="20"/>
+            </w:pPr>
+            <w:r>
+              <w:rPr>
+                <w:sz w:val="19"/>
+                <w:szCs w:val="19"/>
+              </w:rPr>
+              <w:t xml:space="preserve">UC05: devolver com meio tanque e calcular extrato</w:t>
+            </w:r>
+          </w:p>
+        </w:tc>
+        <w:tc>
+          <w:tcPr>
+            <w:tcW w:type="dxa" w:w="3677"/>
+            <w:tcBorders>
+              <w:top w:val="single" w:color="8EA9DB" w:sz="4"/>
+              <w:left w:val="single" w:color="8EA9DB" w:sz="4"/>
+              <w:bottom w:val="single" w:color="8EA9DB" w:sz="4"/>
+              <w:right w:val="single" w:color="8EA9DB" w:sz="4"/>
+            </w:tcBorders>
+            <w:tcMar>
+              <w:top w:type="dxa" w:w="60"/>
+              <w:left w:type="dxa" w:w="100"/>
+              <w:bottom w:type="dxa" w:w="60"/>
+              <w:right w:type="dxa" w:w="100"/>
+            </w:tcMar>
+          </w:tcPr>
+          <w:p>
+            <w:pPr>
+              <w:spacing w:after="20"/>
+            </w:pPr>
+            <w:r>
+              <w:rPr>
+                <w:sz w:val="19"/>
+                <w:szCs w:val="19"/>
+              </w:rPr>
+              <w:t xml:space="preserve">Extrato com diárias, multa e combustível (R$ 150,00)</w:t>
+            </w:r>
+          </w:p>
+        </w:tc>
+        <w:tc>
+          <w:tcPr>
+            <w:tcW w:type="dxa" w:w="982"/>
+            <w:tcBorders>
+              <w:top w:val="single" w:color="8EA9DB" w:sz="4"/>
+              <w:left w:val="single" w:color="8EA9DB" w:sz="4"/>
+              <w:bottom w:val="single" w:color="8EA9DB" w:sz="4"/>
+              <w:right w:val="single" w:color="8EA9DB" w:sz="4"/>
+            </w:tcBorders>
+            <w:tcMar>
+              <w:top w:type="dxa" w:w="60"/>
+              <w:left w:type="dxa" w:w="100"/>
+              <w:bottom w:type="dxa" w:w="60"/>
+              <w:right w:type="dxa" w:w="100"/>
+            </w:tcMar>
+          </w:tcPr>
+          <w:p>
+            <w:pPr>
+              <w:spacing w:after="20"/>
+            </w:pPr>
+            <w:r>
+              <w:rPr>
+                <w:sz w:val="19"/>
+                <w:szCs w:val="19"/>
+              </w:rPr>
+              <w:t xml:space="preserve">OK</w:t>
+            </w:r>
+          </w:p>
+        </w:tc>
+      </w:tr>
+      <w:tr>
+        <w:trPr>
+          <w:cantSplit/>
+        </w:trPr>
+        <w:tc>
+          <w:tcPr>
+            <w:tcW w:type="dxa" w:w="735"/>
+            <w:tcBorders>
+              <w:top w:val="single" w:color="8EA9DB" w:sz="4"/>
+              <w:left w:val="single" w:color="8EA9DB" w:sz="4"/>
+              <w:bottom w:val="single" w:color="8EA9DB" w:sz="4"/>
+              <w:right w:val="single" w:color="8EA9DB" w:sz="4"/>
+            </w:tcBorders>
+            <w:tcMar>
+              <w:top w:type="dxa" w:w="60"/>
+              <w:left w:type="dxa" w:w="100"/>
+              <w:bottom w:type="dxa" w:w="60"/>
+              <w:right w:type="dxa" w:w="100"/>
+            </w:tcMar>
+          </w:tcPr>
+          <w:p>
+            <w:pPr>
+              <w:spacing w:after="20"/>
+            </w:pPr>
+            <w:r>
+              <w:rPr>
+                <w:sz w:val="19"/>
+                <w:szCs w:val="19"/>
+              </w:rPr>
+              <w:t xml:space="preserve">9</w:t>
+            </w:r>
+          </w:p>
+        </w:tc>
+        <w:tc>
+          <w:tcPr>
+            <w:tcW w:type="dxa" w:w="3677"/>
+            <w:tcBorders>
+              <w:top w:val="single" w:color="8EA9DB" w:sz="4"/>
+              <w:left w:val="single" w:color="8EA9DB" w:sz="4"/>
+              <w:bottom w:val="single" w:color="8EA9DB" w:sz="4"/>
+              <w:right w:val="single" w:color="8EA9DB" w:sz="4"/>
+            </w:tcBorders>
+            <w:tcMar>
+              <w:top w:type="dxa" w:w="60"/>
+              <w:left w:type="dxa" w:w="100"/>
+              <w:bottom w:type="dxa" w:w="60"/>
+              <w:right w:type="dxa" w:w="100"/>
+            </w:tcMar>
+          </w:tcPr>
+          <w:p>
+            <w:pPr>
+              <w:spacing w:after="20"/>
+            </w:pPr>
+            <w:r>
+              <w:rPr>
+                <w:sz w:val="19"/>
+                <w:szCs w:val="19"/>
+              </w:rPr>
+              <w:t xml:space="preserve">UC05: marcar avaria sem descrição; descrever e confirmar</w:t>
+            </w:r>
+          </w:p>
+        </w:tc>
+        <w:tc>
+          <w:tcPr>
+            <w:tcW w:type="dxa" w:w="3677"/>
+            <w:tcBorders>
+              <w:top w:val="single" w:color="8EA9DB" w:sz="4"/>
+              <w:left w:val="single" w:color="8EA9DB" w:sz="4"/>
+              <w:bottom w:val="single" w:color="8EA9DB" w:sz="4"/>
+              <w:right w:val="single" w:color="8EA9DB" w:sz="4"/>
+            </w:tcBorders>
+            <w:tcMar>
+              <w:top w:type="dxa" w:w="60"/>
+              <w:left w:type="dxa" w:w="100"/>
+              <w:bottom w:type="dxa" w:w="60"/>
+              <w:right w:type="dxa" w:w="100"/>
+            </w:tcMar>
+          </w:tcPr>
+          <w:p>
+            <w:pPr>
+              <w:spacing w:after="20"/>
+            </w:pPr>
+            <w:r>
+              <w:rPr>
+                <w:sz w:val="19"/>
+                <w:szCs w:val="19"/>
+              </w:rPr>
+              <w:t xml:space="preserve">Erro “Descreva a avaria”; depois devolução registrada, caução retida</w:t>
+            </w:r>
+          </w:p>
+        </w:tc>
+        <w:tc>
+          <w:tcPr>
+            <w:tcW w:type="dxa" w:w="982"/>
+            <w:tcBorders>
+              <w:top w:val="single" w:color="8EA9DB" w:sz="4"/>
+              <w:left w:val="single" w:color="8EA9DB" w:sz="4"/>
+              <w:bottom w:val="single" w:color="8EA9DB" w:sz="4"/>
+              <w:right w:val="single" w:color="8EA9DB" w:sz="4"/>
+            </w:tcBorders>
+            <w:tcMar>
+              <w:top w:type="dxa" w:w="60"/>
+              <w:left w:type="dxa" w:w="100"/>
+              <w:bottom w:type="dxa" w:w="60"/>
+              <w:right w:type="dxa" w:w="100"/>
+            </w:tcMar>
+          </w:tcPr>
+          <w:p>
+            <w:pPr>
+              <w:spacing w:after="20"/>
+            </w:pPr>
+            <w:r>
+              <w:rPr>
+                <w:sz w:val="19"/>
+                <w:szCs w:val="19"/>
+              </w:rPr>
+              <w:t xml:space="preserve">OK</w:t>
+            </w:r>
+          </w:p>
+        </w:tc>
+      </w:tr>
+      <w:tr>
+        <w:trPr>
+          <w:cantSplit/>
+        </w:trPr>
+        <w:tc>
+          <w:tcPr>
+            <w:tcW w:type="dxa" w:w="735"/>
+            <w:tcBorders>
+              <w:top w:val="single" w:color="8EA9DB" w:sz="4"/>
+              <w:left w:val="single" w:color="8EA9DB" w:sz="4"/>
+              <w:bottom w:val="single" w:color="8EA9DB" w:sz="4"/>
+              <w:right w:val="single" w:color="8EA9DB" w:sz="4"/>
+            </w:tcBorders>
+            <w:tcMar>
+              <w:top w:type="dxa" w:w="60"/>
+              <w:left w:type="dxa" w:w="100"/>
+              <w:bottom w:type="dxa" w:w="60"/>
+              <w:right w:type="dxa" w:w="100"/>
+            </w:tcMar>
+          </w:tcPr>
+          <w:p>
+            <w:pPr>
+              <w:spacing w:after="20"/>
+            </w:pPr>
+            <w:r>
+              <w:rPr>
+                <w:sz w:val="19"/>
+                <w:szCs w:val="19"/>
+              </w:rPr>
+              <w:t xml:space="preserve">10</w:t>
+            </w:r>
+          </w:p>
+        </w:tc>
+        <w:tc>
+          <w:tcPr>
+            <w:tcW w:type="dxa" w:w="3677"/>
+            <w:tcBorders>
+              <w:top w:val="single" w:color="8EA9DB" w:sz="4"/>
+              <w:left w:val="single" w:color="8EA9DB" w:sz="4"/>
+              <w:bottom w:val="single" w:color="8EA9DB" w:sz="4"/>
+              <w:right w:val="single" w:color="8EA9DB" w:sz="4"/>
+            </w:tcBorders>
+            <w:tcMar>
+              <w:top w:type="dxa" w:w="60"/>
+              <w:left w:type="dxa" w:w="100"/>
+              <w:bottom w:type="dxa" w:w="60"/>
+              <w:right w:type="dxa" w:w="100"/>
+            </w:tcMar>
+          </w:tcPr>
+          <w:p>
+            <w:pPr>
+              <w:spacing w:after="20"/>
+            </w:pPr>
+            <w:r>
+              <w:rPr>
+                <w:sz w:val="19"/>
+                <w:szCs w:val="19"/>
+              </w:rPr>
+              <w:t xml:space="preserve">RN18: consultar o veículo</w:t>
+            </w:r>
+          </w:p>
+        </w:tc>
+        <w:tc>
+          <w:tcPr>
+            <w:tcW w:type="dxa" w:w="3677"/>
+            <w:tcBorders>
+              <w:top w:val="single" w:color="8EA9DB" w:sz="4"/>
+              <w:left w:val="single" w:color="8EA9DB" w:sz="4"/>
+              <w:bottom w:val="single" w:color="8EA9DB" w:sz="4"/>
+              <w:right w:val="single" w:color="8EA9DB" w:sz="4"/>
+            </w:tcBorders>
+            <w:tcMar>
+              <w:top w:type="dxa" w:w="60"/>
+              <w:left w:type="dxa" w:w="100"/>
+              <w:bottom w:type="dxa" w:w="60"/>
+              <w:right w:type="dxa" w:w="100"/>
+            </w:tcMar>
+          </w:tcPr>
+          <w:p>
+            <w:pPr>
+              <w:spacing w:after="20"/>
+            </w:pPr>
+            <w:r>
+              <w:rPr>
+                <w:sz w:val="19"/>
+                <w:szCs w:val="19"/>
+              </w:rPr>
+              <w:t xml:space="preserve">Status Em manutenção</w:t>
+            </w:r>
+          </w:p>
+        </w:tc>
+        <w:tc>
+          <w:tcPr>
+            <w:tcW w:type="dxa" w:w="982"/>
+            <w:tcBorders>
+              <w:top w:val="single" w:color="8EA9DB" w:sz="4"/>
+              <w:left w:val="single" w:color="8EA9DB" w:sz="4"/>
+              <w:bottom w:val="single" w:color="8EA9DB" w:sz="4"/>
+              <w:right w:val="single" w:color="8EA9DB" w:sz="4"/>
+            </w:tcBorders>
+            <w:tcMar>
+              <w:top w:type="dxa" w:w="60"/>
+              <w:left w:type="dxa" w:w="100"/>
+              <w:bottom w:type="dxa" w:w="60"/>
+              <w:right w:type="dxa" w:w="100"/>
+            </w:tcMar>
+          </w:tcPr>
+          <w:p>
+            <w:pPr>
+              <w:spacing w:after="20"/>
+            </w:pPr>
+            <w:r>
+              <w:rPr>
+                <w:sz w:val="19"/>
+                <w:szCs w:val="19"/>
+              </w:rPr>
+              <w:t xml:space="preserve">OK</w:t>
+            </w:r>
+          </w:p>
+        </w:tc>
+      </w:tr>
+      <w:tr>
+        <w:trPr>
+          <w:cantSplit/>
+        </w:trPr>
+        <w:tc>
+          <w:tcPr>
+            <w:tcW w:type="dxa" w:w="735"/>
+            <w:tcBorders>
+              <w:top w:val="single" w:color="8EA9DB" w:sz="4"/>
+              <w:left w:val="single" w:color="8EA9DB" w:sz="4"/>
+              <w:bottom w:val="single" w:color="8EA9DB" w:sz="4"/>
+              <w:right w:val="single" w:color="8EA9DB" w:sz="4"/>
+            </w:tcBorders>
+            <w:tcMar>
+              <w:top w:type="dxa" w:w="60"/>
+              <w:left w:type="dxa" w:w="100"/>
+              <w:bottom w:type="dxa" w:w="60"/>
+              <w:right w:type="dxa" w:w="100"/>
+            </w:tcMar>
+          </w:tcPr>
+          <w:p>
+            <w:pPr>
+              <w:spacing w:after="20"/>
+            </w:pPr>
+            <w:r>
+              <w:rPr>
+                <w:sz w:val="19"/>
+                <w:szCs w:val="19"/>
+              </w:rPr>
+              <w:t xml:space="preserve">11</w:t>
+            </w:r>
+          </w:p>
+        </w:tc>
+        <w:tc>
+          <w:tcPr>
+            <w:tcW w:type="dxa" w:w="3677"/>
+            <w:tcBorders>
+              <w:top w:val="single" w:color="8EA9DB" w:sz="4"/>
+              <w:left w:val="single" w:color="8EA9DB" w:sz="4"/>
+              <w:bottom w:val="single" w:color="8EA9DB" w:sz="4"/>
+              <w:right w:val="single" w:color="8EA9DB" w:sz="4"/>
+            </w:tcBorders>
+            <w:tcMar>
+              <w:top w:type="dxa" w:w="60"/>
+              <w:left w:type="dxa" w:w="100"/>
+              <w:bottom w:type="dxa" w:w="60"/>
+              <w:right w:type="dxa" w:w="100"/>
+            </w:tcMar>
+          </w:tcPr>
+          <w:p>
+            <w:pPr>
+              <w:spacing w:after="20"/>
+            </w:pPr>
+            <w:r>
+              <w:rPr>
+                <w:sz w:val="19"/>
+                <w:szCs w:val="19"/>
+              </w:rPr>
+              <w:t xml:space="preserve">RN17: devolver a locação atrasada do seed</w:t>
+            </w:r>
+          </w:p>
+        </w:tc>
+        <w:tc>
+          <w:tcPr>
+            <w:tcW w:type="dxa" w:w="3677"/>
+            <w:tcBorders>
+              <w:top w:val="single" w:color="8EA9DB" w:sz="4"/>
+              <w:left w:val="single" w:color="8EA9DB" w:sz="4"/>
+              <w:bottom w:val="single" w:color="8EA9DB" w:sz="4"/>
+              <w:right w:val="single" w:color="8EA9DB" w:sz="4"/>
+            </w:tcBorders>
+            <w:tcMar>
+              <w:top w:type="dxa" w:w="60"/>
+              <w:left w:type="dxa" w:w="100"/>
+              <w:bottom w:type="dxa" w:w="60"/>
+              <w:right w:type="dxa" w:w="100"/>
+            </w:tcMar>
+          </w:tcPr>
+          <w:p>
+            <w:pPr>
+              <w:spacing w:after="20"/>
+            </w:pPr>
+            <w:r>
+              <w:rPr>
+                <w:sz w:val="19"/>
+                <w:szCs w:val="19"/>
+              </w:rPr>
+              <w:t xml:space="preserve">Extrato com multa “× 1,5”</w:t>
+            </w:r>
+          </w:p>
+        </w:tc>
+        <w:tc>
+          <w:tcPr>
+            <w:tcW w:type="dxa" w:w="982"/>
+            <w:tcBorders>
+              <w:top w:val="single" w:color="8EA9DB" w:sz="4"/>
+              <w:left w:val="single" w:color="8EA9DB" w:sz="4"/>
+              <w:bottom w:val="single" w:color="8EA9DB" w:sz="4"/>
+              <w:right w:val="single" w:color="8EA9DB" w:sz="4"/>
+            </w:tcBorders>
+            <w:tcMar>
+              <w:top w:type="dxa" w:w="60"/>
+              <w:left w:type="dxa" w:w="100"/>
+              <w:bottom w:type="dxa" w:w="60"/>
+              <w:right w:type="dxa" w:w="100"/>
+            </w:tcMar>
+          </w:tcPr>
+          <w:p>
+            <w:pPr>
+              <w:spacing w:after="20"/>
+            </w:pPr>
+            <w:r>
+              <w:rPr>
+                <w:sz w:val="19"/>
+                <w:szCs w:val="19"/>
+              </w:rPr>
+              <w:t xml:space="preserve">OK</w:t>
+            </w:r>
+          </w:p>
+        </w:tc>
+      </w:tr>
+      <w:tr>
+        <w:trPr>
+          <w:cantSplit/>
+        </w:trPr>
+        <w:tc>
+          <w:tcPr>
+            <w:tcW w:type="dxa" w:w="735"/>
+            <w:tcBorders>
+              <w:top w:val="single" w:color="8EA9DB" w:sz="4"/>
+              <w:left w:val="single" w:color="8EA9DB" w:sz="4"/>
+              <w:bottom w:val="single" w:color="8EA9DB" w:sz="4"/>
+              <w:right w:val="single" w:color="8EA9DB" w:sz="4"/>
+            </w:tcBorders>
+            <w:tcMar>
+              <w:top w:type="dxa" w:w="60"/>
+              <w:left w:type="dxa" w:w="100"/>
+              <w:bottom w:type="dxa" w:w="60"/>
+              <w:right w:type="dxa" w:w="100"/>
+            </w:tcMar>
+          </w:tcPr>
+          <w:p>
+            <w:pPr>
+              <w:spacing w:after="20"/>
+            </w:pPr>
+            <w:r>
+              <w:rPr>
+                <w:sz w:val="19"/>
+                <w:szCs w:val="19"/>
+              </w:rPr>
+              <w:t xml:space="preserve">12</w:t>
+            </w:r>
+          </w:p>
+        </w:tc>
+        <w:tc>
+          <w:tcPr>
+            <w:tcW w:type="dxa" w:w="3677"/>
+            <w:tcBorders>
+              <w:top w:val="single" w:color="8EA9DB" w:sz="4"/>
+              <w:left w:val="single" w:color="8EA9DB" w:sz="4"/>
+              <w:bottom w:val="single" w:color="8EA9DB" w:sz="4"/>
+              <w:right w:val="single" w:color="8EA9DB" w:sz="4"/>
+            </w:tcBorders>
+            <w:tcMar>
+              <w:top w:type="dxa" w:w="60"/>
+              <w:left w:type="dxa" w:w="100"/>
+              <w:bottom w:type="dxa" w:w="60"/>
+              <w:right w:type="dxa" w:w="100"/>
+            </w:tcMar>
+          </w:tcPr>
+          <w:p>
+            <w:pPr>
+              <w:spacing w:after="20"/>
+            </w:pPr>
+            <w:r>
+              <w:rPr>
+                <w:sz w:val="19"/>
+                <w:szCs w:val="19"/>
+              </w:rPr>
+              <w:t xml:space="preserve">Abrir em tela de celular (375 px) e usar o menu</w:t>
+            </w:r>
+          </w:p>
+        </w:tc>
+        <w:tc>
+          <w:tcPr>
+            <w:tcW w:type="dxa" w:w="3677"/>
+            <w:tcBorders>
+              <w:top w:val="single" w:color="8EA9DB" w:sz="4"/>
+              <w:left w:val="single" w:color="8EA9DB" w:sz="4"/>
+              <w:bottom w:val="single" w:color="8EA9DB" w:sz="4"/>
+              <w:right w:val="single" w:color="8EA9DB" w:sz="4"/>
+            </w:tcBorders>
+            <w:tcMar>
+              <w:top w:type="dxa" w:w="60"/>
+              <w:left w:type="dxa" w:w="100"/>
+              <w:bottom w:type="dxa" w:w="60"/>
+              <w:right w:type="dxa" w:w="100"/>
+            </w:tcMar>
+          </w:tcPr>
+          <w:p>
+            <w:pPr>
+              <w:spacing w:after="20"/>
+            </w:pPr>
+            <w:r>
+              <w:rPr>
+                <w:sz w:val="19"/>
+                <w:szCs w:val="19"/>
+              </w:rPr>
+              <w:t xml:space="preserve">Sem rolagem horizontal; menu recolhível abre</w:t>
+            </w:r>
+          </w:p>
+        </w:tc>
+        <w:tc>
+          <w:tcPr>
+            <w:tcW w:type="dxa" w:w="982"/>
+            <w:tcBorders>
+              <w:top w:val="single" w:color="8EA9DB" w:sz="4"/>
+              <w:left w:val="single" w:color="8EA9DB" w:sz="4"/>
+              <w:bottom w:val="single" w:color="8EA9DB" w:sz="4"/>
+              <w:right w:val="single" w:color="8EA9DB" w:sz="4"/>
+            </w:tcBorders>
+            <w:tcMar>
+              <w:top w:type="dxa" w:w="60"/>
+              <w:left w:type="dxa" w:w="100"/>
+              <w:bottom w:type="dxa" w:w="60"/>
+              <w:right w:type="dxa" w:w="100"/>
+            </w:tcMar>
+          </w:tcPr>
+          <w:p>
+            <w:pPr>
+              <w:spacing w:after="20"/>
+            </w:pPr>
+            <w:r>
+              <w:rPr>
+                <w:sz w:val="19"/>
+                <w:szCs w:val="19"/>
+              </w:rPr>
+              <w:t xml:space="preserve">OK</w:t>
+            </w:r>
+          </w:p>
+        </w:tc>
+      </w:tr>
+      <w:tr>
+        <w:trPr>
+          <w:cantSplit/>
+        </w:trPr>
+        <w:tc>
+          <w:tcPr>
+            <w:tcW w:type="dxa" w:w="735"/>
+            <w:tcBorders>
+              <w:top w:val="single" w:color="8EA9DB" w:sz="4"/>
+              <w:left w:val="single" w:color="8EA9DB" w:sz="4"/>
+              <w:bottom w:val="single" w:color="8EA9DB" w:sz="4"/>
+              <w:right w:val="single" w:color="8EA9DB" w:sz="4"/>
+            </w:tcBorders>
+            <w:tcMar>
+              <w:top w:type="dxa" w:w="60"/>
+              <w:left w:type="dxa" w:w="100"/>
+              <w:bottom w:type="dxa" w:w="60"/>
+              <w:right w:type="dxa" w:w="100"/>
+            </w:tcMar>
+          </w:tcPr>
+          <w:p>
+            <w:pPr>
+              <w:spacing w:after="20"/>
+            </w:pPr>
+            <w:r>
+              <w:rPr>
+                <w:sz w:val="19"/>
+                <w:szCs w:val="19"/>
+              </w:rPr>
+              <w:t xml:space="preserve">13</w:t>
+            </w:r>
+          </w:p>
+        </w:tc>
+        <w:tc>
+          <w:tcPr>
+            <w:tcW w:type="dxa" w:w="3677"/>
+            <w:tcBorders>
+              <w:top w:val="single" w:color="8EA9DB" w:sz="4"/>
+              <w:left w:val="single" w:color="8EA9DB" w:sz="4"/>
+              <w:bottom w:val="single" w:color="8EA9DB" w:sz="4"/>
+              <w:right w:val="single" w:color="8EA9DB" w:sz="4"/>
+            </w:tcBorders>
+            <w:tcMar>
+              <w:top w:type="dxa" w:w="60"/>
+              <w:left w:type="dxa" w:w="100"/>
+              <w:bottom w:type="dxa" w:w="60"/>
+              <w:right w:type="dxa" w:w="100"/>
+            </w:tcMar>
+          </w:tcPr>
+          <w:p>
+            <w:pPr>
+              <w:spacing w:after="20"/>
+            </w:pPr>
+            <w:r>
+              <w:rPr>
+                <w:sz w:val="19"/>
+                <w:szCs w:val="19"/>
+              </w:rPr>
+              <w:t xml:space="preserve">Durante todo o roteiro</w:t>
+            </w:r>
+          </w:p>
+        </w:tc>
+        <w:tc>
+          <w:tcPr>
+            <w:tcW w:type="dxa" w:w="3677"/>
+            <w:tcBorders>
+              <w:top w:val="single" w:color="8EA9DB" w:sz="4"/>
+              <w:left w:val="single" w:color="8EA9DB" w:sz="4"/>
+              <w:bottom w:val="single" w:color="8EA9DB" w:sz="4"/>
+              <w:right w:val="single" w:color="8EA9DB" w:sz="4"/>
+            </w:tcBorders>
+            <w:tcMar>
+              <w:top w:type="dxa" w:w="60"/>
+              <w:left w:type="dxa" w:w="100"/>
+              <w:bottom w:type="dxa" w:w="60"/>
+              <w:right w:type="dxa" w:w="100"/>
+            </w:tcMar>
+          </w:tcPr>
+          <w:p>
+            <w:pPr>
+              <w:spacing w:after="20"/>
+            </w:pPr>
+            <w:r>
+              <w:rPr>
+                <w:sz w:val="19"/>
+                <w:szCs w:val="19"/>
+              </w:rPr>
+              <w:t xml:space="preserve">Nenhum erro de JavaScript nem HTTP 500</w:t>
+            </w:r>
+          </w:p>
+        </w:tc>
+        <w:tc>
+          <w:tcPr>
+            <w:tcW w:type="dxa" w:w="982"/>
+            <w:tcBorders>
+              <w:top w:val="single" w:color="8EA9DB" w:sz="4"/>
+              <w:left w:val="single" w:color="8EA9DB" w:sz="4"/>
+              <w:bottom w:val="single" w:color="8EA9DB" w:sz="4"/>
+              <w:right w:val="single" w:color="8EA9DB" w:sz="4"/>
+            </w:tcBorders>
+            <w:tcMar>
+              <w:top w:type="dxa" w:w="60"/>
+              <w:left w:type="dxa" w:w="100"/>
+              <w:bottom w:type="dxa" w:w="60"/>
+              <w:right w:type="dxa" w:w="100"/>
+            </w:tcMar>
+          </w:tcPr>
+          <w:p>
+            <w:pPr>
+              <w:spacing w:after="20"/>
+            </w:pPr>
+            <w:r>
+              <w:rPr>
+                <w:sz w:val="19"/>
+                <w:szCs w:val="19"/>
+              </w:rPr>
+              <w:t xml:space="preserve">OK</w:t>
+            </w:r>
+          </w:p>
+        </w:tc>
+      </w:tr>
+    </w:tbl>
+    <w:p>
+      <w:pPr>
+        <w:spacing w:after="160"/>
+      </w:pPr>
+    </w:p>
+    <w:p>
+      <w:pPr>
+        <w:pStyle w:val="Heading1"/>
+        <w:pageBreakBefore/>
+      </w:pPr>
+      <w:r>
+        <w:t xml:space="preserve">7 REFERÊNCIAS E RECURSOS</w:t>
+      </w:r>
+    </w:p>
+    <w:p>
+      <w:pPr>
+        <w:spacing w:after="120" w:line="360"/>
+        <w:jc w:val="both"/>
+      </w:pPr>
+      <w:r>
+        <w:t xml:space="preserve">ASSOCIAÇÃO BRASILEIRA DE NORMAS TÉCNICAS. </w:t>
+      </w:r>
+      <w:r>
+        <w:rPr>
+          <w:b/>
+          <w:bCs/>
+        </w:rPr>
+        <w:t xml:space="preserve">NBR 14724</w:t>
+      </w:r>
+      <w:r>
+        <w:t xml:space="preserve">: informação e documentação — trabalhos acadêmicos — apresentação. Rio de Janeiro: ABNT, 2011.</w:t>
+      </w:r>
+    </w:p>
+    <w:p>
+      <w:pPr>
+        <w:spacing w:after="120" w:line="360"/>
+        <w:jc w:val="both"/>
+      </w:pPr>
+      <w:r>
+        <w:t xml:space="preserve">BOOTSTRAP. </w:t>
+      </w:r>
+      <w:r>
+        <w:rPr>
+          <w:b/>
+          <w:bCs/>
+        </w:rPr>
+        <w:t xml:space="preserve">Bootstrap 5.3 documentation</w:t>
+      </w:r>
+      <w:r>
+        <w:t xml:space="preserve">. Disponível em: https://getbootstrap.com/docs/5.3/. Acesso em: 11 out. 2026.</w:t>
+      </w:r>
+    </w:p>
+    <w:p>
+      <w:pPr>
+        <w:spacing w:after="120" w:line="360"/>
+        <w:jc w:val="both"/>
+      </w:pPr>
+      <w:r>
+        <w:t xml:space="preserve">CONVENTIONAL COMMITS. </w:t>
+      </w:r>
+      <w:r>
+        <w:rPr>
+          <w:b/>
+          <w:bCs/>
+        </w:rPr>
+        <w:t xml:space="preserve">Conventional Commits 1.0.0</w:t>
+      </w:r>
+      <w:r>
+        <w:t xml:space="preserve">. Disponível em: https://www.conventionalcommits.org/pt-br/v1.0.0/. Acesso em: 11 out. 2026.</w:t>
+      </w:r>
+    </w:p>
+    <w:p>
+      <w:pPr>
+        <w:spacing w:after="120" w:line="360"/>
+        <w:jc w:val="both"/>
+      </w:pPr>
+      <w:r>
+        <w:t xml:space="preserve">DJANGO SOFTWARE FOUNDATION. </w:t>
+      </w:r>
+      <w:r>
+        <w:rPr>
+          <w:b/>
+          <w:bCs/>
+        </w:rPr>
+        <w:t xml:space="preserve">Django 5.2 documentation</w:t>
+      </w:r>
+      <w:r>
+        <w:t xml:space="preserve">. Disponível em: https://docs.djangoproject.com/pt-br/5.2/. Acesso em: 11 out. 2026.</w:t>
+      </w:r>
+    </w:p>
+    <w:p>
+      <w:pPr>
+        <w:spacing w:after="120" w:line="360"/>
+        <w:jc w:val="both"/>
+      </w:pPr>
+      <w:r>
+        <w:t xml:space="preserve">EVANS, Eric. </w:t>
+      </w:r>
+      <w:r>
+        <w:rPr>
+          <w:b/>
+          <w:bCs/>
+        </w:rPr>
+        <w:t xml:space="preserve">Domain-Driven Design</w:t>
+      </w:r>
+      <w:r>
+        <w:t xml:space="preserve">: atacando as complexidades no coração do software. 3. ed. Rio de Janeiro: Alta Books, 2016.</w:t>
+      </w:r>
+    </w:p>
+    <w:p>
+      <w:pPr>
+        <w:spacing w:after="120" w:line="360"/>
+        <w:jc w:val="both"/>
+      </w:pPr>
+      <w:r>
+        <w:t xml:space="preserve">FOWLER, Martin. </w:t>
+      </w:r>
+      <w:r>
+        <w:rPr>
+          <w:b/>
+          <w:bCs/>
+        </w:rPr>
+        <w:t xml:space="preserve">UML essencial</w:t>
+      </w:r>
+      <w:r>
+        <w:t xml:space="preserve">: um breve guia para a linguagem-padrão de modelagem de objetos. 3. ed. Porto Alegre: Bookman, 2005.</w:t>
+      </w:r>
+    </w:p>
+    <w:p>
+      <w:pPr>
+        <w:spacing w:after="120" w:line="360"/>
+        <w:jc w:val="both"/>
+      </w:pPr>
+      <w:r>
+        <w:t xml:space="preserve">GITHUB. </w:t>
+      </w:r>
+      <w:r>
+        <w:rPr>
+          <w:b/>
+          <w:bCs/>
+        </w:rPr>
+        <w:t xml:space="preserve">GitHub flow</w:t>
+      </w:r>
+      <w:r>
+        <w:t xml:space="preserve">. Disponível em: https://docs.github.com/pt/get-started/using-github/github-flow. Acesso em: 11 out. 2026.</w:t>
+      </w:r>
+    </w:p>
+    <w:p>
+      <w:pPr>
+        <w:spacing w:after="120" w:line="360"/>
+        <w:jc w:val="both"/>
+      </w:pPr>
+      <w:r>
+        <w:t xml:space="preserve">MERMAID. </w:t>
+      </w:r>
+      <w:r>
+        <w:rPr>
+          <w:b/>
+          <w:bCs/>
+        </w:rPr>
+        <w:t xml:space="preserve">Mermaid documentation</w:t>
+      </w:r>
+      <w:r>
+        <w:t xml:space="preserve">. Disponível em: https://mermaid.js.org/. Acesso em: 11 out. 2026.</w:t>
+      </w:r>
+    </w:p>
+    <w:p>
+      <w:pPr>
+        <w:spacing w:after="120" w:line="360"/>
+        <w:jc w:val="both"/>
+      </w:pPr>
+      <w:r>
+        <w:t xml:space="preserve">NYGARD, Michael. </w:t>
+      </w:r>
+      <w:r>
+        <w:rPr>
+          <w:b/>
+          <w:bCs/>
+        </w:rPr>
+        <w:t xml:space="preserve">Documenting architecture decisions</w:t>
+      </w:r>
+      <w:r>
+        <w:t xml:space="preserve">. 2011. Disponível em: https://cognitect.com/blog/2011/11/15/documenting-architecture-decisions. Acesso em: 11 out. 2026.</w:t>
+      </w:r>
+    </w:p>
+    <w:p>
+      <w:pPr>
+        <w:spacing w:after="120" w:line="360"/>
+        <w:jc w:val="both"/>
+      </w:pPr>
+      <w:r>
+        <w:t xml:space="preserve">PYTHON SOFTWARE FOUNDATION. </w:t>
+      </w:r>
+      <w:r>
+        <w:rPr>
+          <w:b/>
+          <w:bCs/>
+        </w:rPr>
+        <w:t xml:space="preserve">PEP 8 – Style Guide for Python Code</w:t>
+      </w:r>
+      <w:r>
+        <w:t xml:space="preserve">. Disponível em: https://peps.python.org/pep-0008/. Acesso em: 11 out. 2026.</w:t>
+      </w:r>
+    </w:p>
+    <w:p>
+      <w:pPr>
+        <w:spacing w:after="120" w:line="360"/>
+        <w:jc w:val="both"/>
+      </w:pPr>
+      <w:r>
+        <w:t xml:space="preserve">PYTHON SOFTWARE FOUNDATION. </w:t>
+      </w:r>
+      <w:r>
+        <w:rPr>
+          <w:b/>
+          <w:bCs/>
+        </w:rPr>
+        <w:t xml:space="preserve">decimal — Decimal fixed point and floating point arithmetic</w:t>
+      </w:r>
+      <w:r>
+        <w:t xml:space="preserve">. Disponível em: https://docs.python.org/3/library/decimal.html. Acesso em: 11 out. 2026.</w:t>
+      </w:r>
+    </w:p>
+    <w:p>
+      <w:pPr>
+        <w:spacing w:after="120" w:line="360"/>
+        <w:jc w:val="both"/>
+      </w:pPr>
+      <w:r>
+        <w:t xml:space="preserve">SOMMERVILLE, Ian. </w:t>
+      </w:r>
+      <w:r>
+        <w:rPr>
+          <w:b/>
+          <w:bCs/>
+        </w:rPr>
+        <w:t xml:space="preserve">Engenharia de software</w:t>
+      </w:r>
+      <w:r>
+        <w:t xml:space="preserve">. 10. ed. São Paulo: Pearson, 2018.</w:t>
+      </w:r>
+    </w:p>
+    <w:p>
+      <w:pPr>
+        <w:spacing w:after="120" w:line="360"/>
+        <w:jc w:val="both"/>
+      </w:pPr>
+      <w:r>
+        <w:t xml:space="preserve">VOCKE, Ham. </w:t>
+      </w:r>
+      <w:r>
+        <w:rPr>
+          <w:b/>
+          <w:bCs/>
+        </w:rPr>
+        <w:t xml:space="preserve">The practical test pyramid</w:t>
+      </w:r>
+      <w:r>
+        <w:t xml:space="preserve">. 2018. Disponível em: https://martinfowler.com/articles/practical-test-pyramid.html. Acesso em: 11 out. 2026.</w:t>
+      </w:r>
+    </w:p>
+    <w:p>
+      <w:pPr>
+        <w:pStyle w:val="Heading3"/>
+      </w:pPr>
+      <w:r>
+        <w:t xml:space="preserve">Recursos do projeto</w:t>
       </w:r>
     </w:p>
     <w:p>
@@ -28021,504 +30960,7 @@
         <w:spacing w:after="60" w:line="300"/>
       </w:pPr>
       <w:r>
-        <w:rPr>
-          <w:b/>
-          <w:bCs/>
-        </w:rPr>
-        <w:t xml:space="preserve">Medição de cobertura</w:t>
-      </w:r>
-      <w:r>
-        <w:t xml:space="preserve"> (coverage.py) não faz parte da entrega; a cobertura funcional é garantida pela matriz RN → teste da seção 1.4.2 e do Apêndice E.</w:t>
-      </w:r>
-    </w:p>
-    <w:p>
-      <w:pPr>
-        <w:pStyle w:val="Heading2"/>
-      </w:pPr>
-      <w:r>
-        <w:t xml:space="preserve">6.2 Execução</w:t>
-      </w:r>
-    </w:p>
-    <w:p>
-      <w:pPr>
-        <w:spacing w:after="120" w:line="360"/>
-        <w:jc w:val="both"/>
-      </w:pPr>
-      <w:r>
-        <w:t xml:space="preserve">Com o ambiente virtual ativado, na raiz do projeto:</w:t>
-      </w:r>
-    </w:p>
-    <w:p>
-      <w:pPr>
-        <w:shd w:fill="F2F2F2" w:color="auto" w:val="clear"/>
-        <w:spacing w:after="0" w:before="60"/>
-        <w:ind w:left="200" w:right="200"/>
-      </w:pPr>
-      <w:r>
-        <w:rPr>
-          <w:rFonts w:ascii="Consolas" w:cs="Consolas" w:eastAsia="Consolas" w:hAnsi="Consolas"/>
-          <w:sz w:val="18"/>
-          <w:szCs w:val="18"/>
-        </w:rPr>
-        <w:t xml:space="preserve">python manage.py test                          # todos os testes</w:t>
-      </w:r>
-    </w:p>
-    <w:p>
-      <w:pPr>
-        <w:shd w:fill="F2F2F2" w:color="auto" w:val="clear"/>
-        <w:spacing w:after="0" w:before="0"/>
-        <w:ind w:left="200" w:right="200"/>
-      </w:pPr>
-      <w:r>
-        <w:rPr>
-          <w:rFonts w:ascii="Consolas" w:cs="Consolas" w:eastAsia="Consolas" w:hAnsi="Consolas"/>
-          <w:sz w:val="18"/>
-          <w:szCs w:val="18"/>
-        </w:rPr>
-        <w:t xml:space="preserve">python manage.py test locacao.tests.test_services   # só as fórmulas</w:t>
-      </w:r>
-    </w:p>
-    <w:p>
-      <w:pPr>
-        <w:shd w:fill="F2F2F2" w:color="auto" w:val="clear"/>
-        <w:spacing w:after="0" w:before="0"/>
-        <w:ind w:left="200" w:right="200"/>
-      </w:pPr>
-      <w:r>
-        <w:rPr>
-          <w:rFonts w:ascii="Consolas" w:cs="Consolas" w:eastAsia="Consolas" w:hAnsi="Consolas"/>
-          <w:sz w:val="18"/>
-          <w:szCs w:val="18"/>
-        </w:rPr>
-        <w:t xml:space="preserve">python manage.py test locacao.tests.test_rules      # só as regras</w:t>
-      </w:r>
-    </w:p>
-    <w:p>
-      <w:pPr>
-        <w:shd w:fill="F2F2F2" w:color="auto" w:val="clear"/>
-        <w:spacing w:after="160" w:before="0"/>
-        <w:ind w:left="200" w:right="200"/>
-      </w:pPr>
-      <w:r>
-        <w:rPr>
-          <w:rFonts w:ascii="Consolas" w:cs="Consolas" w:eastAsia="Consolas" w:hAnsi="Consolas"/>
-          <w:sz w:val="18"/>
-          <w:szCs w:val="18"/>
-        </w:rPr>
-        <w:t xml:space="preserve">python manage.py test -v 2                     # lista cada teste executado</w:t>
-      </w:r>
-    </w:p>
-    <w:p>
-      <w:pPr>
-        <w:spacing w:after="120" w:line="360"/>
-        <w:jc w:val="both"/>
-      </w:pPr>
-      <w:r>
-        <w:t xml:space="preserve">Saída esperada:</w:t>
-      </w:r>
-    </w:p>
-    <w:p>
-      <w:pPr>
-        <w:shd w:fill="F2F2F2" w:color="auto" w:val="clear"/>
-        <w:spacing w:after="0" w:before="60"/>
-        <w:ind w:left="200" w:right="200"/>
-      </w:pPr>
-      <w:r>
-        <w:rPr>
-          <w:rFonts w:ascii="Consolas" w:cs="Consolas" w:eastAsia="Consolas" w:hAnsi="Consolas"/>
-          <w:sz w:val="18"/>
-          <w:szCs w:val="18"/>
-        </w:rPr>
-        <w:t xml:space="preserve">Found 64 test(s).</w:t>
-      </w:r>
-    </w:p>
-    <w:p>
-      <w:pPr>
-        <w:shd w:fill="F2F2F2" w:color="auto" w:val="clear"/>
-        <w:spacing w:after="0" w:before="0"/>
-        <w:ind w:left="200" w:right="200"/>
-      </w:pPr>
-      <w:r>
-        <w:rPr>
-          <w:rFonts w:ascii="Consolas" w:cs="Consolas" w:eastAsia="Consolas" w:hAnsi="Consolas"/>
-          <w:sz w:val="18"/>
-          <w:szCs w:val="18"/>
-        </w:rPr>
-        <w:t xml:space="preserve">Creating test database for alias 'default'...</w:t>
-      </w:r>
-    </w:p>
-    <w:p>
-      <w:pPr>
-        <w:shd w:fill="F2F2F2" w:color="auto" w:val="clear"/>
-        <w:spacing w:after="0" w:before="0"/>
-        <w:ind w:left="200" w:right="200"/>
-      </w:pPr>
-      <w:r>
-        <w:rPr>
-          <w:rFonts w:ascii="Consolas" w:cs="Consolas" w:eastAsia="Consolas" w:hAnsi="Consolas"/>
-          <w:sz w:val="18"/>
-          <w:szCs w:val="18"/>
-        </w:rPr>
-        <w:t xml:space="preserve">System check identified no issues (0 silenced).</w:t>
-      </w:r>
-    </w:p>
-    <w:p>
-      <w:pPr>
-        <w:shd w:fill="F2F2F2" w:color="auto" w:val="clear"/>
-        <w:spacing w:after="0" w:before="0"/>
-        <w:ind w:left="200" w:right="200"/>
-      </w:pPr>
-      <w:r>
-        <w:rPr>
-          <w:rFonts w:ascii="Consolas" w:cs="Consolas" w:eastAsia="Consolas" w:hAnsi="Consolas"/>
-          <w:sz w:val="18"/>
-          <w:szCs w:val="18"/>
-        </w:rPr>
-        <w:t xml:space="preserve">................................................................</w:t>
-      </w:r>
-    </w:p>
-    <w:p>
-      <w:pPr>
-        <w:shd w:fill="F2F2F2" w:color="auto" w:val="clear"/>
-        <w:spacing w:after="0" w:before="0"/>
-        <w:ind w:left="200" w:right="200"/>
-      </w:pPr>
-      <w:r>
-        <w:rPr>
-          <w:rFonts w:ascii="Consolas" w:cs="Consolas" w:eastAsia="Consolas" w:hAnsi="Consolas"/>
-          <w:sz w:val="18"/>
-          <w:szCs w:val="18"/>
-        </w:rPr>
-        <w:t xml:space="preserve">----------------------------------------------------------------------</w:t>
-      </w:r>
-    </w:p>
-    <w:p>
-      <w:pPr>
-        <w:shd w:fill="F2F2F2" w:color="auto" w:val="clear"/>
-        <w:spacing w:after="0" w:before="0"/>
-        <w:ind w:left="200" w:right="200"/>
-      </w:pPr>
-      <w:r>
-        <w:rPr>
-          <w:rFonts w:ascii="Consolas" w:cs="Consolas" w:eastAsia="Consolas" w:hAnsi="Consolas"/>
-          <w:sz w:val="18"/>
-          <w:szCs w:val="18"/>
-        </w:rPr>
-        <w:t xml:space="preserve">Ran 64 tests in 2.4s</w:t>
-      </w:r>
-    </w:p>
-    <w:p>
-      <w:pPr>
-        <w:shd w:fill="F2F2F2" w:color="auto" w:val="clear"/>
-        <w:spacing w:after="0" w:before="0"/>
-        <w:ind w:left="200" w:right="200"/>
-      </w:pPr>
-      <w:r>
-        <w:rPr>
-          <w:rFonts w:ascii="Consolas" w:cs="Consolas" w:eastAsia="Consolas" w:hAnsi="Consolas"/>
-          <w:sz w:val="18"/>
-          <w:szCs w:val="18"/>
-        </w:rPr>
-        <w:t xml:space="preserve"> </w:t>
-      </w:r>
-    </w:p>
-    <w:p>
-      <w:pPr>
-        <w:shd w:fill="F2F2F2" w:color="auto" w:val="clear"/>
-        <w:spacing w:after="160" w:before="0"/>
-        <w:ind w:left="200" w:right="200"/>
-      </w:pPr>
-      <w:r>
-        <w:rPr>
-          <w:rFonts w:ascii="Consolas" w:cs="Consolas" w:eastAsia="Consolas" w:hAnsi="Consolas"/>
-          <w:sz w:val="18"/>
-          <w:szCs w:val="18"/>
-        </w:rPr>
-        <w:t xml:space="preserve">OK</w:t>
-      </w:r>
-    </w:p>
-    <w:p>
-      <w:pPr>
-        <w:spacing w:after="120" w:line="360"/>
-        <w:jc w:val="both"/>
-      </w:pPr>
-      <w:r>
-        <w:t xml:space="preserve">O banco de testes é criado e destruído automaticamente; os dados de desenvolvimento (</w:t>
-      </w:r>
-      <w:r>
-        <w:rPr>
-          <w:rFonts w:ascii="Consolas" w:cs="Consolas" w:eastAsia="Consolas" w:hAnsi="Consolas"/>
-          <w:sz w:val="20"/>
-          <w:szCs w:val="20"/>
-        </w:rPr>
-        <w:t xml:space="preserve">db.sqlite3</w:t>
-      </w:r>
-      <w:r>
-        <w:t xml:space="preserve">) não são afetados. Os testes devem ser executados antes de cada commit e de cada Pull Request.</w:t>
-      </w:r>
-    </w:p>
-    <w:p>
-      <w:pPr>
-        <w:pStyle w:val="Heading1"/>
-        <w:pageBreakBefore/>
-      </w:pPr>
-      <w:r>
-        <w:t xml:space="preserve">7 REFERÊNCIAS E RECURSOS</w:t>
-      </w:r>
-    </w:p>
-    <w:p>
-      <w:pPr>
-        <w:spacing w:after="120" w:line="360"/>
-        <w:jc w:val="both"/>
-      </w:pPr>
-      <w:r>
-        <w:t xml:space="preserve">ASSOCIAÇÃO BRASILEIRA DE NORMAS TÉCNICAS. </w:t>
-      </w:r>
-      <w:r>
-        <w:rPr>
-          <w:b/>
-          <w:bCs/>
-        </w:rPr>
-        <w:t xml:space="preserve">NBR 14724</w:t>
-      </w:r>
-      <w:r>
-        <w:t xml:space="preserve">: informação e documentação — trabalhos acadêmicos — apresentação. Rio de Janeiro: ABNT, 2011.</w:t>
-      </w:r>
-    </w:p>
-    <w:p>
-      <w:pPr>
-        <w:spacing w:after="120" w:line="360"/>
-        <w:jc w:val="both"/>
-      </w:pPr>
-      <w:r>
-        <w:t xml:space="preserve">BOOTSTRAP. </w:t>
-      </w:r>
-      <w:r>
-        <w:rPr>
-          <w:b/>
-          <w:bCs/>
-        </w:rPr>
-        <w:t xml:space="preserve">Bootstrap 5.3 documentation</w:t>
-      </w:r>
-      <w:r>
-        <w:t xml:space="preserve">. Disponível em: https://getbootstrap.com/docs/5.3/. Acesso em: 11 out. 2026.</w:t>
-      </w:r>
-    </w:p>
-    <w:p>
-      <w:pPr>
-        <w:spacing w:after="120" w:line="360"/>
-        <w:jc w:val="both"/>
-      </w:pPr>
-      <w:r>
-        <w:t xml:space="preserve">CONVENTIONAL COMMITS. </w:t>
-      </w:r>
-      <w:r>
-        <w:rPr>
-          <w:b/>
-          <w:bCs/>
-        </w:rPr>
-        <w:t xml:space="preserve">Conventional Commits 1.0.0</w:t>
-      </w:r>
-      <w:r>
-        <w:t xml:space="preserve">. Disponível em: https://www.conventionalcommits.org/pt-br/v1.0.0/. Acesso em: 11 out. 2026.</w:t>
-      </w:r>
-    </w:p>
-    <w:p>
-      <w:pPr>
-        <w:spacing w:after="120" w:line="360"/>
-        <w:jc w:val="both"/>
-      </w:pPr>
-      <w:r>
-        <w:t xml:space="preserve">DJANGO SOFTWARE FOUNDATION. </w:t>
-      </w:r>
-      <w:r>
-        <w:rPr>
-          <w:b/>
-          <w:bCs/>
-        </w:rPr>
-        <w:t xml:space="preserve">Django 5.2 documentation</w:t>
-      </w:r>
-      <w:r>
-        <w:t xml:space="preserve">. Disponível em: https://docs.djangoproject.com/pt-br/5.2/. Acesso em: 11 out. 2026.</w:t>
-      </w:r>
-    </w:p>
-    <w:p>
-      <w:pPr>
-        <w:spacing w:after="120" w:line="360"/>
-        <w:jc w:val="both"/>
-      </w:pPr>
-      <w:r>
-        <w:t xml:space="preserve">EVANS, Eric. </w:t>
-      </w:r>
-      <w:r>
-        <w:rPr>
-          <w:b/>
-          <w:bCs/>
-        </w:rPr>
-        <w:t xml:space="preserve">Domain-Driven Design</w:t>
-      </w:r>
-      <w:r>
-        <w:t xml:space="preserve">: atacando as complexidades no coração do software. 3. ed. Rio de Janeiro: Alta Books, 2016.</w:t>
-      </w:r>
-    </w:p>
-    <w:p>
-      <w:pPr>
-        <w:spacing w:after="120" w:line="360"/>
-        <w:jc w:val="both"/>
-      </w:pPr>
-      <w:r>
-        <w:t xml:space="preserve">FOWLER, Martin. </w:t>
-      </w:r>
-      <w:r>
-        <w:rPr>
-          <w:b/>
-          <w:bCs/>
-        </w:rPr>
-        <w:t xml:space="preserve">UML essencial</w:t>
-      </w:r>
-      <w:r>
-        <w:t xml:space="preserve">: um breve guia para a linguagem-padrão de modelagem de objetos. 3. ed. Porto Alegre: Bookman, 2005.</w:t>
-      </w:r>
-    </w:p>
-    <w:p>
-      <w:pPr>
-        <w:spacing w:after="120" w:line="360"/>
-        <w:jc w:val="both"/>
-      </w:pPr>
-      <w:r>
-        <w:t xml:space="preserve">GITHUB. </w:t>
-      </w:r>
-      <w:r>
-        <w:rPr>
-          <w:b/>
-          <w:bCs/>
-        </w:rPr>
-        <w:t xml:space="preserve">GitHub flow</w:t>
-      </w:r>
-      <w:r>
-        <w:t xml:space="preserve">. Disponível em: https://docs.github.com/pt/get-started/using-github/github-flow. Acesso em: 11 out. 2026.</w:t>
-      </w:r>
-    </w:p>
-    <w:p>
-      <w:pPr>
-        <w:spacing w:after="120" w:line="360"/>
-        <w:jc w:val="both"/>
-      </w:pPr>
-      <w:r>
-        <w:t xml:space="preserve">MERMAID. </w:t>
-      </w:r>
-      <w:r>
-        <w:rPr>
-          <w:b/>
-          <w:bCs/>
-        </w:rPr>
-        <w:t xml:space="preserve">Mermaid documentation</w:t>
-      </w:r>
-      <w:r>
-        <w:t xml:space="preserve">. Disponível em: https://mermaid.js.org/. Acesso em: 11 out. 2026.</w:t>
-      </w:r>
-    </w:p>
-    <w:p>
-      <w:pPr>
-        <w:spacing w:after="120" w:line="360"/>
-        <w:jc w:val="both"/>
-      </w:pPr>
-      <w:r>
-        <w:t xml:space="preserve">NYGARD, Michael. </w:t>
-      </w:r>
-      <w:r>
-        <w:rPr>
-          <w:b/>
-          <w:bCs/>
-        </w:rPr>
-        <w:t xml:space="preserve">Documenting architecture decisions</w:t>
-      </w:r>
-      <w:r>
-        <w:t xml:space="preserve">. 2011. Disponível em: https://cognitect.com/blog/2011/11/15/documenting-architecture-decisions. Acesso em: 11 out. 2026.</w:t>
-      </w:r>
-    </w:p>
-    <w:p>
-      <w:pPr>
-        <w:spacing w:after="120" w:line="360"/>
-        <w:jc w:val="both"/>
-      </w:pPr>
-      <w:r>
-        <w:t xml:space="preserve">PYTHON SOFTWARE FOUNDATION. </w:t>
-      </w:r>
-      <w:r>
-        <w:rPr>
-          <w:b/>
-          <w:bCs/>
-        </w:rPr>
-        <w:t xml:space="preserve">PEP 8 – Style Guide for Python Code</w:t>
-      </w:r>
-      <w:r>
-        <w:t xml:space="preserve">. Disponível em: https://peps.python.org/pep-0008/. Acesso em: 11 out. 2026.</w:t>
-      </w:r>
-    </w:p>
-    <w:p>
-      <w:pPr>
-        <w:spacing w:after="120" w:line="360"/>
-        <w:jc w:val="both"/>
-      </w:pPr>
-      <w:r>
-        <w:t xml:space="preserve">PYTHON SOFTWARE FOUNDATION. </w:t>
-      </w:r>
-      <w:r>
-        <w:rPr>
-          <w:b/>
-          <w:bCs/>
-        </w:rPr>
-        <w:t xml:space="preserve">decimal — Decimal fixed point and floating point arithmetic</w:t>
-      </w:r>
-      <w:r>
-        <w:t xml:space="preserve">. Disponível em: https://docs.python.org/3/library/decimal.html. Acesso em: 11 out. 2026.</w:t>
-      </w:r>
-    </w:p>
-    <w:p>
-      <w:pPr>
-        <w:spacing w:after="120" w:line="360"/>
-        <w:jc w:val="both"/>
-      </w:pPr>
-      <w:r>
-        <w:t xml:space="preserve">SOMMERVILLE, Ian. </w:t>
-      </w:r>
-      <w:r>
-        <w:rPr>
-          <w:b/>
-          <w:bCs/>
-        </w:rPr>
-        <w:t xml:space="preserve">Engenharia de software</w:t>
-      </w:r>
-      <w:r>
-        <w:t xml:space="preserve">. 10. ed. São Paulo: Pearson, 2018.</w:t>
-      </w:r>
-    </w:p>
-    <w:p>
-      <w:pPr>
-        <w:spacing w:after="120" w:line="360"/>
-        <w:jc w:val="both"/>
-      </w:pPr>
-      <w:r>
-        <w:t xml:space="preserve">VOCKE, Ham. </w:t>
-      </w:r>
-      <w:r>
-        <w:rPr>
-          <w:b/>
-          <w:bCs/>
-        </w:rPr>
-        <w:t xml:space="preserve">The practical test pyramid</w:t>
-      </w:r>
-      <w:r>
-        <w:t xml:space="preserve">. 2018. Disponível em: https://martinfowler.com/articles/practical-test-pyramid.html. Acesso em: 11 out. 2026.</w:t>
-      </w:r>
-    </w:p>
-    <w:p>
-      <w:pPr>
-        <w:pStyle w:val="Heading3"/>
-      </w:pPr>
-      <w:r>
-        <w:t xml:space="preserve">Recursos do projeto</w:t>
+        <w:t xml:space="preserve">Repositório: https://github.com/bruno011203/projeto-da-loca-o-de-carros</w:t>
       </w:r>
     </w:p>
     <w:p>
@@ -28531,7 +30973,7 @@
         <w:spacing w:after="60" w:line="300"/>
       </w:pPr>
       <w:r>
-        <w:t xml:space="preserve">Repositório: https://github.com/bruno011203/projeto-da-loca-o-de-carros</w:t>
+        <w:t xml:space="preserve">Documentos de base: “Locadora de Veículos — Modelo de Domínio e Regras de Negócio” e “Stack e passo a passo” (10/10/2026).</w:t>
       </w:r>
     </w:p>
     <w:p>
@@ -28544,19 +30986,6 @@
         <w:spacing w:after="60" w:line="300"/>
       </w:pPr>
       <w:r>
-        <w:t xml:space="preserve">Documentos de base: “Locadora de Veículos — Modelo de Domínio e Regras de Negócio” e “Stack e passo a passo” (10/10/2026).</w:t>
-      </w:r>
-    </w:p>
-    <w:p>
-      <w:pPr>
-        <w:pStyle w:val="ListParagraph"/>
-        <w:numPr>
-          <w:ilvl w:val="0"/>
-          <w:numId w:val="2"/>
-        </w:numPr>
-        <w:spacing w:after="60" w:line="300"/>
-      </w:pPr>
-      <w:r>
         <w:t xml:space="preserve">Fontes dos diagramas: </w:t>
       </w:r>
       <w:r>
@@ -28623,7 +31052,7 @@
           <w:sz w:val="20"/>
           <w:szCs w:val="20"/>
         </w:rPr>
-        <w:t xml:space="preserve">Tabela 34 — Itens fora do escopo e proposta de evolução</w:t>
+        <w:t xml:space="preserve">Tabela 35 — Itens fora do escopo e proposta de evolução</w:t>
       </w:r>
     </w:p>
     <w:tbl>
@@ -29839,7 +32268,7 @@
           <w:sz w:val="20"/>
           <w:szCs w:val="20"/>
         </w:rPr>
-        <w:t xml:space="preserve">Tabela 35 — Usuários criados pelo comando seed</w:t>
+        <w:t xml:space="preserve">Tabela 36 — Usuários criados pelo comando seed</w:t>
       </w:r>
     </w:p>
     <w:tbl>
@@ -30271,7 +32700,7 @@
           <w:sz w:val="20"/>
           <w:szCs w:val="20"/>
         </w:rPr>
-        <w:t xml:space="preserve">Tabela 36 — Requisito → caso de uso → regra → teste</w:t>
+        <w:t xml:space="preserve">Tabela 37 — Requisito → caso de uso → regra → teste</w:t>
       </w:r>
     </w:p>
     <w:tbl>
@@ -31268,6 +33697,922 @@
                 <w:szCs w:val="19"/>
               </w:rPr>
               <w:t xml:space="preserve">test_login_obrigatorio, test_paginas_carregam, test_ciclo_completo_pela_interface</w:t>
+            </w:r>
+          </w:p>
+        </w:tc>
+      </w:tr>
+    </w:tbl>
+    <w:p>
+      <w:pPr>
+        <w:spacing w:after="160"/>
+      </w:pPr>
+    </w:p>
+    <w:p>
+      <w:pPr>
+        <w:pStyle w:val="Heading2"/>
+      </w:pPr>
+      <w:r>
+        <w:t xml:space="preserve">Apêndice F — Registro de defeitos encontrados nos testes</w:t>
+      </w:r>
+    </w:p>
+    <w:p>
+      <w:pPr>
+        <w:spacing w:after="120" w:line="360"/>
+        <w:jc w:val="both"/>
+      </w:pPr>
+      <w:r>
+        <w:t xml:space="preserve">Defeitos encontrados nos testes exploratórios e de sistema, todos corrigidos e protegidos por teste de regressão (o teste falha no código antigo e passa no corrigido).</w:t>
+      </w:r>
+    </w:p>
+    <w:p>
+      <w:pPr>
+        <w:keepNext/>
+        <w:spacing w:after="80" w:before="200"/>
+        <w:jc w:val="center"/>
+      </w:pPr>
+      <w:r>
+        <w:rPr>
+          <w:b/>
+          <w:bCs/>
+          <w:sz w:val="20"/>
+          <w:szCs w:val="20"/>
+        </w:rPr>
+        <w:t xml:space="preserve">Tabela 38 — Defeitos encontrados e corrigidos</w:t>
+      </w:r>
+    </w:p>
+    <w:tbl>
+      <w:tblPr>
+        <w:tblW w:type="dxa" w:w="9071"/>
+        <w:tblBorders>
+          <w:top w:val="single" w:color="auto" w:sz="4"/>
+          <w:left w:val="single" w:color="auto" w:sz="4"/>
+          <w:bottom w:val="single" w:color="auto" w:sz="4"/>
+          <w:right w:val="single" w:color="auto" w:sz="4"/>
+          <w:insideH w:val="single" w:color="auto" w:sz="4"/>
+          <w:insideV w:val="single" w:color="auto" w:sz="4"/>
+        </w:tblBorders>
+      </w:tblPr>
+      <w:tblGrid>
+        <w:gridCol w:w="533"/>
+        <w:gridCol w:w="3414"/>
+        <w:gridCol w:w="2561"/>
+        <w:gridCol w:w="2563"/>
+      </w:tblGrid>
+      <w:tr>
+        <w:trPr>
+          <w:tblHeader/>
+        </w:trPr>
+        <w:tc>
+          <w:tcPr>
+            <w:tcW w:type="dxa" w:w="533"/>
+            <w:tcBorders>
+              <w:top w:val="single" w:color="8EA9DB" w:sz="4"/>
+              <w:left w:val="single" w:color="8EA9DB" w:sz="4"/>
+              <w:bottom w:val="single" w:color="8EA9DB" w:sz="4"/>
+              <w:right w:val="single" w:color="8EA9DB" w:sz="4"/>
+            </w:tcBorders>
+            <w:shd w:fill="D9E2F3" w:color="auto" w:val="clear"/>
+            <w:tcMar>
+              <w:top w:type="dxa" w:w="60"/>
+              <w:left w:type="dxa" w:w="100"/>
+              <w:bottom w:type="dxa" w:w="60"/>
+              <w:right w:type="dxa" w:w="100"/>
+            </w:tcMar>
+          </w:tcPr>
+          <w:p>
+            <w:pPr>
+              <w:spacing w:after="20"/>
+            </w:pPr>
+            <w:r>
+              <w:rPr>
+                <w:b/>
+                <w:bCs/>
+                <w:sz w:val="19"/>
+                <w:szCs w:val="19"/>
+              </w:rPr>
+              <w:t xml:space="preserve">#</w:t>
+            </w:r>
+          </w:p>
+        </w:tc>
+        <w:tc>
+          <w:tcPr>
+            <w:tcW w:type="dxa" w:w="3414"/>
+            <w:tcBorders>
+              <w:top w:val="single" w:color="8EA9DB" w:sz="4"/>
+              <w:left w:val="single" w:color="8EA9DB" w:sz="4"/>
+              <w:bottom w:val="single" w:color="8EA9DB" w:sz="4"/>
+              <w:right w:val="single" w:color="8EA9DB" w:sz="4"/>
+            </w:tcBorders>
+            <w:shd w:fill="D9E2F3" w:color="auto" w:val="clear"/>
+            <w:tcMar>
+              <w:top w:type="dxa" w:w="60"/>
+              <w:left w:type="dxa" w:w="100"/>
+              <w:bottom w:type="dxa" w:w="60"/>
+              <w:right w:type="dxa" w:w="100"/>
+            </w:tcMar>
+          </w:tcPr>
+          <w:p>
+            <w:pPr>
+              <w:spacing w:after="20"/>
+            </w:pPr>
+            <w:r>
+              <w:rPr>
+                <w:b/>
+                <w:bCs/>
+                <w:sz w:val="19"/>
+                <w:szCs w:val="19"/>
+              </w:rPr>
+              <w:t xml:space="preserve">Defeito</w:t>
+            </w:r>
+          </w:p>
+        </w:tc>
+        <w:tc>
+          <w:tcPr>
+            <w:tcW w:type="dxa" w:w="2561"/>
+            <w:tcBorders>
+              <w:top w:val="single" w:color="8EA9DB" w:sz="4"/>
+              <w:left w:val="single" w:color="8EA9DB" w:sz="4"/>
+              <w:bottom w:val="single" w:color="8EA9DB" w:sz="4"/>
+              <w:right w:val="single" w:color="8EA9DB" w:sz="4"/>
+            </w:tcBorders>
+            <w:shd w:fill="D9E2F3" w:color="auto" w:val="clear"/>
+            <w:tcMar>
+              <w:top w:type="dxa" w:w="60"/>
+              <w:left w:type="dxa" w:w="100"/>
+              <w:bottom w:type="dxa" w:w="60"/>
+              <w:right w:type="dxa" w:w="100"/>
+            </w:tcMar>
+          </w:tcPr>
+          <w:p>
+            <w:pPr>
+              <w:spacing w:after="20"/>
+            </w:pPr>
+            <w:r>
+              <w:rPr>
+                <w:b/>
+                <w:bCs/>
+                <w:sz w:val="19"/>
+                <w:szCs w:val="19"/>
+              </w:rPr>
+              <w:t xml:space="preserve">Correção</w:t>
+            </w:r>
+          </w:p>
+        </w:tc>
+        <w:tc>
+          <w:tcPr>
+            <w:tcW w:type="dxa" w:w="2563"/>
+            <w:tcBorders>
+              <w:top w:val="single" w:color="8EA9DB" w:sz="4"/>
+              <w:left w:val="single" w:color="8EA9DB" w:sz="4"/>
+              <w:bottom w:val="single" w:color="8EA9DB" w:sz="4"/>
+              <w:right w:val="single" w:color="8EA9DB" w:sz="4"/>
+            </w:tcBorders>
+            <w:shd w:fill="D9E2F3" w:color="auto" w:val="clear"/>
+            <w:tcMar>
+              <w:top w:type="dxa" w:w="60"/>
+              <w:left w:type="dxa" w:w="100"/>
+              <w:bottom w:type="dxa" w:w="60"/>
+              <w:right w:type="dxa" w:w="100"/>
+            </w:tcMar>
+          </w:tcPr>
+          <w:p>
+            <w:pPr>
+              <w:spacing w:after="20"/>
+            </w:pPr>
+            <w:r>
+              <w:rPr>
+                <w:b/>
+                <w:bCs/>
+                <w:sz w:val="19"/>
+                <w:szCs w:val="19"/>
+              </w:rPr>
+              <w:t xml:space="preserve">Teste de regressão</w:t>
+            </w:r>
+          </w:p>
+        </w:tc>
+      </w:tr>
+      <w:tr>
+        <w:trPr>
+          <w:cantSplit/>
+        </w:trPr>
+        <w:tc>
+          <w:tcPr>
+            <w:tcW w:type="dxa" w:w="533"/>
+            <w:tcBorders>
+              <w:top w:val="single" w:color="8EA9DB" w:sz="4"/>
+              <w:left w:val="single" w:color="8EA9DB" w:sz="4"/>
+              <w:bottom w:val="single" w:color="8EA9DB" w:sz="4"/>
+              <w:right w:val="single" w:color="8EA9DB" w:sz="4"/>
+            </w:tcBorders>
+            <w:tcMar>
+              <w:top w:type="dxa" w:w="60"/>
+              <w:left w:type="dxa" w:w="100"/>
+              <w:bottom w:type="dxa" w:w="60"/>
+              <w:right w:type="dxa" w:w="100"/>
+            </w:tcMar>
+          </w:tcPr>
+          <w:p>
+            <w:pPr>
+              <w:spacing w:after="20"/>
+            </w:pPr>
+            <w:r>
+              <w:rPr>
+                <w:sz w:val="19"/>
+                <w:szCs w:val="19"/>
+              </w:rPr>
+              <w:t xml:space="preserve">D1</w:t>
+            </w:r>
+          </w:p>
+        </w:tc>
+        <w:tc>
+          <w:tcPr>
+            <w:tcW w:type="dxa" w:w="3414"/>
+            <w:tcBorders>
+              <w:top w:val="single" w:color="8EA9DB" w:sz="4"/>
+              <w:left w:val="single" w:color="8EA9DB" w:sz="4"/>
+              <w:bottom w:val="single" w:color="8EA9DB" w:sz="4"/>
+              <w:right w:val="single" w:color="8EA9DB" w:sz="4"/>
+            </w:tcBorders>
+            <w:tcMar>
+              <w:top w:type="dxa" w:w="60"/>
+              <w:left w:type="dxa" w:w="100"/>
+              <w:bottom w:type="dxa" w:w="60"/>
+              <w:right w:type="dxa" w:w="100"/>
+            </w:tcMar>
+          </w:tcPr>
+          <w:p>
+            <w:pPr>
+              <w:spacing w:after="20"/>
+            </w:pPr>
+            <w:r>
+              <w:rPr>
+                <w:sz w:val="19"/>
+                <w:szCs w:val="19"/>
+              </w:rPr>
+              <w:t xml:space="preserve">Erro 500 ao abrir a tela de nova reserva com identificador de veículo inválido na URL</w:t>
+            </w:r>
+          </w:p>
+        </w:tc>
+        <w:tc>
+          <w:tcPr>
+            <w:tcW w:type="dxa" w:w="2561"/>
+            <w:tcBorders>
+              <w:top w:val="single" w:color="8EA9DB" w:sz="4"/>
+              <w:left w:val="single" w:color="8EA9DB" w:sz="4"/>
+              <w:bottom w:val="single" w:color="8EA9DB" w:sz="4"/>
+              <w:right w:val="single" w:color="8EA9DB" w:sz="4"/>
+            </w:tcBorders>
+            <w:tcMar>
+              <w:top w:type="dxa" w:w="60"/>
+              <w:left w:type="dxa" w:w="100"/>
+              <w:bottom w:type="dxa" w:w="60"/>
+              <w:right w:type="dxa" w:w="100"/>
+            </w:tcMar>
+          </w:tcPr>
+          <w:p>
+            <w:pPr>
+              <w:spacing w:after="20"/>
+            </w:pPr>
+            <w:r>
+              <w:rPr>
+                <w:sz w:val="19"/>
+                <w:szCs w:val="19"/>
+              </w:rPr>
+              <w:t xml:space="preserve">A tela volta para a busca de disponibilidade</w:t>
+            </w:r>
+          </w:p>
+        </w:tc>
+        <w:tc>
+          <w:tcPr>
+            <w:tcW w:type="dxa" w:w="2563"/>
+            <w:tcBorders>
+              <w:top w:val="single" w:color="8EA9DB" w:sz="4"/>
+              <w:left w:val="single" w:color="8EA9DB" w:sz="4"/>
+              <w:bottom w:val="single" w:color="8EA9DB" w:sz="4"/>
+              <w:right w:val="single" w:color="8EA9DB" w:sz="4"/>
+            </w:tcBorders>
+            <w:tcMar>
+              <w:top w:type="dxa" w:w="60"/>
+              <w:left w:type="dxa" w:w="100"/>
+              <w:bottom w:type="dxa" w:w="60"/>
+              <w:right w:type="dxa" w:w="100"/>
+            </w:tcMar>
+          </w:tcPr>
+          <w:p>
+            <w:pPr>
+              <w:spacing w:after="20"/>
+            </w:pPr>
+            <w:r>
+              <w:rPr>
+                <w:sz w:val="19"/>
+                <w:szCs w:val="19"/>
+              </w:rPr>
+              <w:t xml:space="preserve">test_reserva_com_parametros_invalidos_volta_para_a_busca</w:t>
+            </w:r>
+          </w:p>
+        </w:tc>
+      </w:tr>
+      <w:tr>
+        <w:trPr>
+          <w:cantSplit/>
+        </w:trPr>
+        <w:tc>
+          <w:tcPr>
+            <w:tcW w:type="dxa" w:w="533"/>
+            <w:tcBorders>
+              <w:top w:val="single" w:color="8EA9DB" w:sz="4"/>
+              <w:left w:val="single" w:color="8EA9DB" w:sz="4"/>
+              <w:bottom w:val="single" w:color="8EA9DB" w:sz="4"/>
+              <w:right w:val="single" w:color="8EA9DB" w:sz="4"/>
+            </w:tcBorders>
+            <w:tcMar>
+              <w:top w:type="dxa" w:w="60"/>
+              <w:left w:type="dxa" w:w="100"/>
+              <w:bottom w:type="dxa" w:w="60"/>
+              <w:right w:type="dxa" w:w="100"/>
+            </w:tcMar>
+          </w:tcPr>
+          <w:p>
+            <w:pPr>
+              <w:spacing w:after="20"/>
+            </w:pPr>
+            <w:r>
+              <w:rPr>
+                <w:sz w:val="19"/>
+                <w:szCs w:val="19"/>
+              </w:rPr>
+              <w:t xml:space="preserve">D2</w:t>
+            </w:r>
+          </w:p>
+        </w:tc>
+        <w:tc>
+          <w:tcPr>
+            <w:tcW w:type="dxa" w:w="3414"/>
+            <w:tcBorders>
+              <w:top w:val="single" w:color="8EA9DB" w:sz="4"/>
+              <w:left w:val="single" w:color="8EA9DB" w:sz="4"/>
+              <w:bottom w:val="single" w:color="8EA9DB" w:sz="4"/>
+              <w:right w:val="single" w:color="8EA9DB" w:sz="4"/>
+            </w:tcBorders>
+            <w:tcMar>
+              <w:top w:type="dxa" w:w="60"/>
+              <w:left w:type="dxa" w:w="100"/>
+              <w:bottom w:type="dxa" w:w="60"/>
+              <w:right w:type="dxa" w:w="100"/>
+            </w:tcMar>
+          </w:tcPr>
+          <w:p>
+            <w:pPr>
+              <w:spacing w:after="20"/>
+            </w:pPr>
+            <w:r>
+              <w:rPr>
+                <w:sz w:val="19"/>
+                <w:szCs w:val="19"/>
+              </w:rPr>
+              <w:t xml:space="preserve">Devolver no mesmo minuto da retirada dava erro RN16, porque a retirada guardava segundos e a tela trabalha com minutos</w:t>
+            </w:r>
+          </w:p>
+        </w:tc>
+        <w:tc>
+          <w:tcPr>
+            <w:tcW w:type="dxa" w:w="2561"/>
+            <w:tcBorders>
+              <w:top w:val="single" w:color="8EA9DB" w:sz="4"/>
+              <w:left w:val="single" w:color="8EA9DB" w:sz="4"/>
+              <w:bottom w:val="single" w:color="8EA9DB" w:sz="4"/>
+              <w:right w:val="single" w:color="8EA9DB" w:sz="4"/>
+            </w:tcBorders>
+            <w:tcMar>
+              <w:top w:type="dxa" w:w="60"/>
+              <w:left w:type="dxa" w:w="100"/>
+              <w:bottom w:type="dxa" w:w="60"/>
+              <w:right w:type="dxa" w:w="100"/>
+            </w:tcMar>
+          </w:tcPr>
+          <w:p>
+            <w:pPr>
+              <w:spacing w:after="20"/>
+            </w:pPr>
+            <w:r>
+              <w:rPr>
+                <w:sz w:val="19"/>
+                <w:szCs w:val="19"/>
+              </w:rPr>
+              <w:t xml:space="preserve">Retirada gravada sem segundos; comparações com precisão de minuto</w:t>
+            </w:r>
+          </w:p>
+        </w:tc>
+        <w:tc>
+          <w:tcPr>
+            <w:tcW w:type="dxa" w:w="2563"/>
+            <w:tcBorders>
+              <w:top w:val="single" w:color="8EA9DB" w:sz="4"/>
+              <w:left w:val="single" w:color="8EA9DB" w:sz="4"/>
+              <w:bottom w:val="single" w:color="8EA9DB" w:sz="4"/>
+              <w:right w:val="single" w:color="8EA9DB" w:sz="4"/>
+            </w:tcBorders>
+            <w:tcMar>
+              <w:top w:type="dxa" w:w="60"/>
+              <w:left w:type="dxa" w:w="100"/>
+              <w:bottom w:type="dxa" w:w="60"/>
+              <w:right w:type="dxa" w:w="100"/>
+            </w:tcMar>
+          </w:tcPr>
+          <w:p>
+            <w:pPr>
+              <w:spacing w:after="20"/>
+            </w:pPr>
+            <w:r>
+              <w:rPr>
+                <w:sz w:val="19"/>
+                <w:szCs w:val="19"/>
+              </w:rPr>
+              <w:t xml:space="preserve">test_devolucao_logo_apos_a_retirada</w:t>
+            </w:r>
+          </w:p>
+        </w:tc>
+      </w:tr>
+      <w:tr>
+        <w:trPr>
+          <w:cantSplit/>
+        </w:trPr>
+        <w:tc>
+          <w:tcPr>
+            <w:tcW w:type="dxa" w:w="533"/>
+            <w:tcBorders>
+              <w:top w:val="single" w:color="8EA9DB" w:sz="4"/>
+              <w:left w:val="single" w:color="8EA9DB" w:sz="4"/>
+              <w:bottom w:val="single" w:color="8EA9DB" w:sz="4"/>
+              <w:right w:val="single" w:color="8EA9DB" w:sz="4"/>
+            </w:tcBorders>
+            <w:tcMar>
+              <w:top w:type="dxa" w:w="60"/>
+              <w:left w:type="dxa" w:w="100"/>
+              <w:bottom w:type="dxa" w:w="60"/>
+              <w:right w:type="dxa" w:w="100"/>
+            </w:tcMar>
+          </w:tcPr>
+          <w:p>
+            <w:pPr>
+              <w:spacing w:after="20"/>
+            </w:pPr>
+            <w:r>
+              <w:rPr>
+                <w:sz w:val="19"/>
+                <w:szCs w:val="19"/>
+              </w:rPr>
+              <w:t xml:space="preserve">D3</w:t>
+            </w:r>
+          </w:p>
+        </w:tc>
+        <w:tc>
+          <w:tcPr>
+            <w:tcW w:type="dxa" w:w="3414"/>
+            <w:tcBorders>
+              <w:top w:val="single" w:color="8EA9DB" w:sz="4"/>
+              <w:left w:val="single" w:color="8EA9DB" w:sz="4"/>
+              <w:bottom w:val="single" w:color="8EA9DB" w:sz="4"/>
+              <w:right w:val="single" w:color="8EA9DB" w:sz="4"/>
+            </w:tcBorders>
+            <w:tcMar>
+              <w:top w:type="dxa" w:w="60"/>
+              <w:left w:type="dxa" w:w="100"/>
+              <w:bottom w:type="dxa" w:w="60"/>
+              <w:right w:type="dxa" w:w="100"/>
+            </w:tcMar>
+          </w:tcPr>
+          <w:p>
+            <w:pPr>
+              <w:spacing w:after="20"/>
+            </w:pPr>
+            <w:r>
+              <w:rPr>
+                <w:sz w:val="19"/>
+                <w:szCs w:val="19"/>
+              </w:rPr>
+              <w:t xml:space="preserve">Prévia do extrato era exibida mesmo com data de devolução anterior à retirada</w:t>
+            </w:r>
+          </w:p>
+        </w:tc>
+        <w:tc>
+          <w:tcPr>
+            <w:tcW w:type="dxa" w:w="2561"/>
+            <w:tcBorders>
+              <w:top w:val="single" w:color="8EA9DB" w:sz="4"/>
+              <w:left w:val="single" w:color="8EA9DB" w:sz="4"/>
+              <w:bottom w:val="single" w:color="8EA9DB" w:sz="4"/>
+              <w:right w:val="single" w:color="8EA9DB" w:sz="4"/>
+            </w:tcBorders>
+            <w:tcMar>
+              <w:top w:type="dxa" w:w="60"/>
+              <w:left w:type="dxa" w:w="100"/>
+              <w:bottom w:type="dxa" w:w="60"/>
+              <w:right w:type="dxa" w:w="100"/>
+            </w:tcMar>
+          </w:tcPr>
+          <w:p>
+            <w:pPr>
+              <w:spacing w:after="20"/>
+            </w:pPr>
+            <w:r>
+              <w:rPr>
+                <w:sz w:val="19"/>
+                <w:szCs w:val="19"/>
+              </w:rPr>
+              <w:t xml:space="preserve">A prévia valida data (RN16), km (RN16) e avaria antes de calcular</w:t>
+            </w:r>
+          </w:p>
+        </w:tc>
+        <w:tc>
+          <w:tcPr>
+            <w:tcW w:type="dxa" w:w="2563"/>
+            <w:tcBorders>
+              <w:top w:val="single" w:color="8EA9DB" w:sz="4"/>
+              <w:left w:val="single" w:color="8EA9DB" w:sz="4"/>
+              <w:bottom w:val="single" w:color="8EA9DB" w:sz="4"/>
+              <w:right w:val="single" w:color="8EA9DB" w:sz="4"/>
+            </w:tcBorders>
+            <w:tcMar>
+              <w:top w:type="dxa" w:w="60"/>
+              <w:left w:type="dxa" w:w="100"/>
+              <w:bottom w:type="dxa" w:w="60"/>
+              <w:right w:type="dxa" w:w="100"/>
+            </w:tcMar>
+          </w:tcPr>
+          <w:p>
+            <w:pPr>
+              <w:spacing w:after="20"/>
+            </w:pPr>
+            <w:r>
+              <w:rPr>
+                <w:sz w:val="19"/>
+                <w:szCs w:val="19"/>
+              </w:rPr>
+              <w:t xml:space="preserve">test_devolucao_valida_data_km_e_avaria_antes_do_extrato</w:t>
+            </w:r>
+          </w:p>
+        </w:tc>
+      </w:tr>
+      <w:tr>
+        <w:trPr>
+          <w:cantSplit/>
+        </w:trPr>
+        <w:tc>
+          <w:tcPr>
+            <w:tcW w:type="dxa" w:w="533"/>
+            <w:tcBorders>
+              <w:top w:val="single" w:color="8EA9DB" w:sz="4"/>
+              <w:left w:val="single" w:color="8EA9DB" w:sz="4"/>
+              <w:bottom w:val="single" w:color="8EA9DB" w:sz="4"/>
+              <w:right w:val="single" w:color="8EA9DB" w:sz="4"/>
+            </w:tcBorders>
+            <w:tcMar>
+              <w:top w:type="dxa" w:w="60"/>
+              <w:left w:type="dxa" w:w="100"/>
+              <w:bottom w:type="dxa" w:w="60"/>
+              <w:right w:type="dxa" w:w="100"/>
+            </w:tcMar>
+          </w:tcPr>
+          <w:p>
+            <w:pPr>
+              <w:spacing w:after="20"/>
+            </w:pPr>
+            <w:r>
+              <w:rPr>
+                <w:sz w:val="19"/>
+                <w:szCs w:val="19"/>
+              </w:rPr>
+              <w:t xml:space="preserve">D4</w:t>
+            </w:r>
+          </w:p>
+        </w:tc>
+        <w:tc>
+          <w:tcPr>
+            <w:tcW w:type="dxa" w:w="3414"/>
+            <w:tcBorders>
+              <w:top w:val="single" w:color="8EA9DB" w:sz="4"/>
+              <w:left w:val="single" w:color="8EA9DB" w:sz="4"/>
+              <w:bottom w:val="single" w:color="8EA9DB" w:sz="4"/>
+              <w:right w:val="single" w:color="8EA9DB" w:sz="4"/>
+            </w:tcBorders>
+            <w:tcMar>
+              <w:top w:type="dxa" w:w="60"/>
+              <w:left w:type="dxa" w:w="100"/>
+              <w:bottom w:type="dxa" w:w="60"/>
+              <w:right w:type="dxa" w:w="100"/>
+            </w:tcMar>
+          </w:tcPr>
+          <w:p>
+            <w:pPr>
+              <w:spacing w:after="20"/>
+            </w:pPr>
+            <w:r>
+              <w:rPr>
+                <w:sz w:val="19"/>
+                <w:szCs w:val="19"/>
+              </w:rPr>
+              <w:t xml:space="preserve">Placa digitada com hífen (ABC-1D23) era recusada por ter 8 caracteres</w:t>
+            </w:r>
+          </w:p>
+        </w:tc>
+        <w:tc>
+          <w:tcPr>
+            <w:tcW w:type="dxa" w:w="2561"/>
+            <w:tcBorders>
+              <w:top w:val="single" w:color="8EA9DB" w:sz="4"/>
+              <w:left w:val="single" w:color="8EA9DB" w:sz="4"/>
+              <w:bottom w:val="single" w:color="8EA9DB" w:sz="4"/>
+              <w:right w:val="single" w:color="8EA9DB" w:sz="4"/>
+            </w:tcBorders>
+            <w:tcMar>
+              <w:top w:type="dxa" w:w="60"/>
+              <w:left w:type="dxa" w:w="100"/>
+              <w:bottom w:type="dxa" w:w="60"/>
+              <w:right w:type="dxa" w:w="100"/>
+            </w:tcMar>
+          </w:tcPr>
+          <w:p>
+            <w:pPr>
+              <w:spacing w:after="20"/>
+            </w:pPr>
+            <w:r>
+              <w:rPr>
+                <w:sz w:val="19"/>
+                <w:szCs w:val="19"/>
+              </w:rPr>
+              <w:t xml:space="preserve">Campo aceita hífen e minúsculas e normaliza para ABC1D23</w:t>
+            </w:r>
+          </w:p>
+        </w:tc>
+        <w:tc>
+          <w:tcPr>
+            <w:tcW w:type="dxa" w:w="2563"/>
+            <w:tcBorders>
+              <w:top w:val="single" w:color="8EA9DB" w:sz="4"/>
+              <w:left w:val="single" w:color="8EA9DB" w:sz="4"/>
+              <w:bottom w:val="single" w:color="8EA9DB" w:sz="4"/>
+              <w:right w:val="single" w:color="8EA9DB" w:sz="4"/>
+            </w:tcBorders>
+            <w:tcMar>
+              <w:top w:type="dxa" w:w="60"/>
+              <w:left w:type="dxa" w:w="100"/>
+              <w:bottom w:type="dxa" w:w="60"/>
+              <w:right w:type="dxa" w:w="100"/>
+            </w:tcMar>
+          </w:tcPr>
+          <w:p>
+            <w:pPr>
+              <w:spacing w:after="20"/>
+            </w:pPr>
+            <w:r>
+              <w:rPr>
+                <w:sz w:val="19"/>
+                <w:szCs w:val="19"/>
+              </w:rPr>
+              <w:t xml:space="preserve">test_placa_com_hifen_e_minusculas_e_normalizada</w:t>
+            </w:r>
+          </w:p>
+        </w:tc>
+      </w:tr>
+      <w:tr>
+        <w:trPr>
+          <w:cantSplit/>
+        </w:trPr>
+        <w:tc>
+          <w:tcPr>
+            <w:tcW w:type="dxa" w:w="533"/>
+            <w:tcBorders>
+              <w:top w:val="single" w:color="8EA9DB" w:sz="4"/>
+              <w:left w:val="single" w:color="8EA9DB" w:sz="4"/>
+              <w:bottom w:val="single" w:color="8EA9DB" w:sz="4"/>
+              <w:right w:val="single" w:color="8EA9DB" w:sz="4"/>
+            </w:tcBorders>
+            <w:tcMar>
+              <w:top w:type="dxa" w:w="60"/>
+              <w:left w:type="dxa" w:w="100"/>
+              <w:bottom w:type="dxa" w:w="60"/>
+              <w:right w:type="dxa" w:w="100"/>
+            </w:tcMar>
+          </w:tcPr>
+          <w:p>
+            <w:pPr>
+              <w:spacing w:after="20"/>
+            </w:pPr>
+            <w:r>
+              <w:rPr>
+                <w:sz w:val="19"/>
+                <w:szCs w:val="19"/>
+              </w:rPr>
+              <w:t xml:space="preserve">D5</w:t>
+            </w:r>
+          </w:p>
+        </w:tc>
+        <w:tc>
+          <w:tcPr>
+            <w:tcW w:type="dxa" w:w="3414"/>
+            <w:tcBorders>
+              <w:top w:val="single" w:color="8EA9DB" w:sz="4"/>
+              <w:left w:val="single" w:color="8EA9DB" w:sz="4"/>
+              <w:bottom w:val="single" w:color="8EA9DB" w:sz="4"/>
+              <w:right w:val="single" w:color="8EA9DB" w:sz="4"/>
+            </w:tcBorders>
+            <w:tcMar>
+              <w:top w:type="dxa" w:w="60"/>
+              <w:left w:type="dxa" w:w="100"/>
+              <w:bottom w:type="dxa" w:w="60"/>
+              <w:right w:type="dxa" w:w="100"/>
+            </w:tcMar>
+          </w:tcPr>
+          <w:p>
+            <w:pPr>
+              <w:spacing w:after="20"/>
+            </w:pPr>
+            <w:r>
+              <w:rPr>
+                <w:sz w:val="19"/>
+                <w:szCs w:val="19"/>
+              </w:rPr>
+              <w:t xml:space="preserve">Cliente podia ser cadastrado com data de nascimento no futuro</w:t>
+            </w:r>
+          </w:p>
+        </w:tc>
+        <w:tc>
+          <w:tcPr>
+            <w:tcW w:type="dxa" w:w="2561"/>
+            <w:tcBorders>
+              <w:top w:val="single" w:color="8EA9DB" w:sz="4"/>
+              <w:left w:val="single" w:color="8EA9DB" w:sz="4"/>
+              <w:bottom w:val="single" w:color="8EA9DB" w:sz="4"/>
+              <w:right w:val="single" w:color="8EA9DB" w:sz="4"/>
+            </w:tcBorders>
+            <w:tcMar>
+              <w:top w:type="dxa" w:w="60"/>
+              <w:left w:type="dxa" w:w="100"/>
+              <w:bottom w:type="dxa" w:w="60"/>
+              <w:right w:type="dxa" w:w="100"/>
+            </w:tcMar>
+          </w:tcPr>
+          <w:p>
+            <w:pPr>
+              <w:spacing w:after="20"/>
+            </w:pPr>
+            <w:r>
+              <w:rPr>
+                <w:sz w:val="19"/>
+                <w:szCs w:val="19"/>
+              </w:rPr>
+              <w:t xml:space="preserve">Validação de data de nascimento no passado</w:t>
+            </w:r>
+          </w:p>
+        </w:tc>
+        <w:tc>
+          <w:tcPr>
+            <w:tcW w:type="dxa" w:w="2563"/>
+            <w:tcBorders>
+              <w:top w:val="single" w:color="8EA9DB" w:sz="4"/>
+              <w:left w:val="single" w:color="8EA9DB" w:sz="4"/>
+              <w:bottom w:val="single" w:color="8EA9DB" w:sz="4"/>
+              <w:right w:val="single" w:color="8EA9DB" w:sz="4"/>
+            </w:tcBorders>
+            <w:tcMar>
+              <w:top w:type="dxa" w:w="60"/>
+              <w:left w:type="dxa" w:w="100"/>
+              <w:bottom w:type="dxa" w:w="60"/>
+              <w:right w:type="dxa" w:w="100"/>
+            </w:tcMar>
+          </w:tcPr>
+          <w:p>
+            <w:pPr>
+              <w:spacing w:after="20"/>
+            </w:pPr>
+            <w:r>
+              <w:rPr>
+                <w:sz w:val="19"/>
+                <w:szCs w:val="19"/>
+              </w:rPr>
+              <w:t xml:space="preserve">test_cliente_com_cpf_formatado_e_nascimento_futuro</w:t>
+            </w:r>
+          </w:p>
+        </w:tc>
+      </w:tr>
+      <w:tr>
+        <w:trPr>
+          <w:cantSplit/>
+        </w:trPr>
+        <w:tc>
+          <w:tcPr>
+            <w:tcW w:type="dxa" w:w="533"/>
+            <w:tcBorders>
+              <w:top w:val="single" w:color="8EA9DB" w:sz="4"/>
+              <w:left w:val="single" w:color="8EA9DB" w:sz="4"/>
+              <w:bottom w:val="single" w:color="8EA9DB" w:sz="4"/>
+              <w:right w:val="single" w:color="8EA9DB" w:sz="4"/>
+            </w:tcBorders>
+            <w:tcMar>
+              <w:top w:type="dxa" w:w="60"/>
+              <w:left w:type="dxa" w:w="100"/>
+              <w:bottom w:type="dxa" w:w="60"/>
+              <w:right w:type="dxa" w:w="100"/>
+            </w:tcMar>
+          </w:tcPr>
+          <w:p>
+            <w:pPr>
+              <w:spacing w:after="20"/>
+            </w:pPr>
+            <w:r>
+              <w:rPr>
+                <w:sz w:val="19"/>
+                <w:szCs w:val="19"/>
+              </w:rPr>
+              <w:t xml:space="preserve">D6</w:t>
+            </w:r>
+          </w:p>
+        </w:tc>
+        <w:tc>
+          <w:tcPr>
+            <w:tcW w:type="dxa" w:w="3414"/>
+            <w:tcBorders>
+              <w:top w:val="single" w:color="8EA9DB" w:sz="4"/>
+              <w:left w:val="single" w:color="8EA9DB" w:sz="4"/>
+              <w:bottom w:val="single" w:color="8EA9DB" w:sz="4"/>
+              <w:right w:val="single" w:color="8EA9DB" w:sz="4"/>
+            </w:tcBorders>
+            <w:tcMar>
+              <w:top w:type="dxa" w:w="60"/>
+              <w:left w:type="dxa" w:w="100"/>
+              <w:bottom w:type="dxa" w:w="60"/>
+              <w:right w:type="dxa" w:w="100"/>
+            </w:tcMar>
+          </w:tcPr>
+          <w:p>
+            <w:pPr>
+              <w:spacing w:after="20"/>
+            </w:pPr>
+            <w:r>
+              <w:rPr>
+                <w:sz w:val="19"/>
+                <w:szCs w:val="19"/>
+              </w:rPr>
+              <w:t xml:space="preserve">Busca aceitava período no passado ou maior que 30 dias, e o erro só aparecia ao confirmar a reserva; no admin, CPF com pontuação e placa com hífen eram recusados e o status LOCADO podia ser definido à mão</w:t>
+            </w:r>
+          </w:p>
+        </w:tc>
+        <w:tc>
+          <w:tcPr>
+            <w:tcW w:type="dxa" w:w="2561"/>
+            <w:tcBorders>
+              <w:top w:val="single" w:color="8EA9DB" w:sz="4"/>
+              <w:left w:val="single" w:color="8EA9DB" w:sz="4"/>
+              <w:bottom w:val="single" w:color="8EA9DB" w:sz="4"/>
+              <w:right w:val="single" w:color="8EA9DB" w:sz="4"/>
+            </w:tcBorders>
+            <w:tcMar>
+              <w:top w:type="dxa" w:w="60"/>
+              <w:left w:type="dxa" w:w="100"/>
+              <w:bottom w:type="dxa" w:w="60"/>
+              <w:right w:type="dxa" w:w="100"/>
+            </w:tcMar>
+          </w:tcPr>
+          <w:p>
+            <w:pPr>
+              <w:spacing w:after="20"/>
+            </w:pPr>
+            <w:r>
+              <w:rPr>
+                <w:sz w:val="19"/>
+                <w:szCs w:val="19"/>
+              </w:rPr>
+              <w:t xml:space="preserve">Busca aplica RN08, RN09 e RN10; o admin usa os mesmos formulários das telas</w:t>
+            </w:r>
+          </w:p>
+        </w:tc>
+        <w:tc>
+          <w:tcPr>
+            <w:tcW w:type="dxa" w:w="2563"/>
+            <w:tcBorders>
+              <w:top w:val="single" w:color="8EA9DB" w:sz="4"/>
+              <w:left w:val="single" w:color="8EA9DB" w:sz="4"/>
+              <w:bottom w:val="single" w:color="8EA9DB" w:sz="4"/>
+              <w:right w:val="single" w:color="8EA9DB" w:sz="4"/>
+            </w:tcBorders>
+            <w:tcMar>
+              <w:top w:type="dxa" w:w="60"/>
+              <w:left w:type="dxa" w:w="100"/>
+              <w:bottom w:type="dxa" w:w="60"/>
+              <w:right w:type="dxa" w:w="100"/>
+            </w:tcMar>
+          </w:tcPr>
+          <w:p>
+            <w:pPr>
+              <w:spacing w:after="20"/>
+            </w:pPr>
+            <w:r>
+              <w:rPr>
+                <w:sz w:val="19"/>
+                <w:szCs w:val="19"/>
+              </w:rPr>
+              <w:t xml:space="preserve">test_busca_aplica_rn08_rn09_rn10, test_admin_usa_as_mesmas_validacoes</w:t>
             </w:r>
           </w:p>
         </w:tc>

</xml_diff>